<commit_message>
Science - 10/25/2026 part 1
</commit_message>
<xml_diff>
--- a/1-Formal sciences/1-Mathematics/2-Mathematical Logic/2-Set Theory/5-My Source/2-Sets.docx
+++ b/1-Formal sciences/1-Mathematics/2-Mathematical Logic/2-Set Theory/5-My Source/2-Sets.docx
@@ -1354,11 +1354,19 @@
                 <w:rFonts w:ascii="Roboto Mono" w:hAnsi="Roboto Mono"/>
               </w:rPr>
             </w:pPr>
+            <w:proofErr w:type="gramStart"/>
             <w:r>
               <w:rPr>
                 <w:rFonts w:ascii="Roboto Mono" w:hAnsi="Roboto Mono"/>
               </w:rPr>
-              <w:t>Usually cannot define a mathematical set</w:t>
+              <w:t>Usually</w:t>
+            </w:r>
+            <w:proofErr w:type="gramEnd"/>
+            <w:r>
+              <w:rPr>
+                <w:rFonts w:ascii="Roboto Mono" w:hAnsi="Roboto Mono"/>
+              </w:rPr>
+              <w:t xml:space="preserve"> cannot define a mathematical set</w:t>
             </w:r>
           </w:p>
         </w:tc>
@@ -5073,8 +5081,16 @@
         <w:rPr>
           <w:rFonts w:ascii="Roboto Mono" w:hAnsi="Roboto Mono"/>
         </w:rPr>
-        <w:t xml:space="preserve"> or :</w:t>
-      </w:r>
+        <w:t xml:space="preserve"> </w:t>
+      </w:r>
+      <w:proofErr w:type="gramStart"/>
+      <w:r>
+        <w:rPr>
+          <w:rFonts w:ascii="Roboto Mono" w:hAnsi="Roboto Mono"/>
+        </w:rPr>
+        <w:t>or :</w:t>
+      </w:r>
+      <w:proofErr w:type="gramEnd"/>
     </w:p>
     <w:p>
       <w:pPr>
@@ -5099,7 +5115,21 @@
         <w:rPr>
           <w:rFonts w:ascii="Roboto Mono" w:hAnsi="Roboto Mono"/>
         </w:rPr>
-        <w:t>: "such that" or "where."</w:t>
+        <w:t>: "such that" or "</w:t>
+      </w:r>
+      <w:proofErr w:type="gramStart"/>
+      <w:r>
+        <w:rPr>
+          <w:rFonts w:ascii="Roboto Mono" w:hAnsi="Roboto Mono"/>
+        </w:rPr>
+        <w:t>where</w:t>
+      </w:r>
+      <w:proofErr w:type="gramEnd"/>
+      <w:r>
+        <w:rPr>
+          <w:rFonts w:ascii="Roboto Mono" w:hAnsi="Roboto Mono"/>
+        </w:rPr>
+        <w:t>."</w:t>
       </w:r>
     </w:p>
     <w:p>
@@ -5202,7 +5232,14 @@
         <w:rPr>
           <w:rFonts w:ascii="Roboto Mono" w:hAnsi="Roboto Mono"/>
         </w:rPr>
-        <w:t>&gt;0}</w:t>
+        <w:t>&gt;0</w:t>
+      </w:r>
+      <w:proofErr w:type="gramStart"/>
+      <w:r>
+        <w:rPr>
+          <w:rFonts w:ascii="Roboto Mono" w:hAnsi="Roboto Mono"/>
+        </w:rPr>
+        <w:t>}</w:t>
       </w:r>
       <w:r>
         <w:rPr>
@@ -5214,7 +5251,14 @@
         <w:rPr>
           <w:rFonts w:ascii="Roboto Mono" w:hAnsi="Roboto Mono"/>
         </w:rPr>
-        <w:t xml:space="preserve"> or {</w:t>
+        <w:t xml:space="preserve"> or</w:t>
+      </w:r>
+      <w:proofErr w:type="gramEnd"/>
+      <w:r>
+        <w:rPr>
+          <w:rFonts w:ascii="Roboto Mono" w:hAnsi="Roboto Mono"/>
+        </w:rPr>
+        <w:t xml:space="preserve"> {</w:t>
       </w:r>
       <w:proofErr w:type="spellStart"/>
       <w:r>
@@ -5485,12 +5529,14 @@
         </w:rPr>
         <w:t>∈</w:t>
       </w:r>
+      <w:proofErr w:type="gramStart"/>
       <w:r>
         <w:rPr>
           <w:rFonts w:ascii="Roboto Mono" w:hAnsi="Roboto Mono"/>
         </w:rPr>
         <w:t>R,x</w:t>
       </w:r>
+      <w:proofErr w:type="gramEnd"/>
       <w:r>
         <w:rPr>
           <w:rFonts w:ascii="Roboto Mono" w:hAnsi="Roboto Mono"/>
@@ -5749,12 +5795,14 @@
         </w:rPr>
         <w:t>∈</w:t>
       </w:r>
+      <w:proofErr w:type="gramStart"/>
       <w:r>
         <w:rPr>
           <w:rFonts w:ascii="Roboto Mono" w:hAnsi="Roboto Mono"/>
         </w:rPr>
         <w:t>Z,x</w:t>
       </w:r>
+      <w:proofErr w:type="gramEnd"/>
       <w:r>
         <w:rPr>
           <w:rFonts w:ascii="Roboto Mono" w:hAnsi="Roboto Mono"/>
@@ -6279,6 +6327,7 @@
         </w:rPr>
         <w:t>≤</w:t>
       </w:r>
+      <w:proofErr w:type="gramStart"/>
       <w:r>
         <w:rPr>
           <w:rFonts w:ascii="Roboto Mono" w:hAnsi="Roboto Mono"/>
@@ -6291,6 +6340,7 @@
         </w:rPr>
         <w:t>⊆</w:t>
       </w:r>
+      <w:proofErr w:type="gramEnd"/>
       <w:r>
         <w:rPr>
           <w:rFonts w:ascii="Roboto Mono" w:hAnsi="Roboto Mono"/>
@@ -6339,7 +6389,14 @@
         <w:rPr>
           <w:rFonts w:ascii="Roboto Mono" w:hAnsi="Roboto Mono"/>
         </w:rPr>
-        <w:t>&lt;5}</w:t>
+        <w:t>&lt;</w:t>
+      </w:r>
+      <w:proofErr w:type="gramStart"/>
+      <w:r>
+        <w:rPr>
+          <w:rFonts w:ascii="Roboto Mono" w:hAnsi="Roboto Mono"/>
+        </w:rPr>
+        <w:t>5}</w:t>
       </w:r>
       <w:r>
         <w:rPr>
@@ -6347,6 +6404,7 @@
         </w:rPr>
         <w:t>⊂</w:t>
       </w:r>
+      <w:proofErr w:type="gramEnd"/>
       <w:r>
         <w:rPr>
           <w:rFonts w:ascii="Roboto Mono" w:hAnsi="Roboto Mono"/>
@@ -6369,7 +6427,14 @@
         <w:rPr>
           <w:rFonts w:ascii="Roboto Mono" w:hAnsi="Roboto Mono"/>
         </w:rPr>
-        <w:t>{1,2,3,4}</w:t>
+        <w:t>{1,2,3,</w:t>
+      </w:r>
+      <w:proofErr w:type="gramStart"/>
+      <w:r>
+        <w:rPr>
+          <w:rFonts w:ascii="Roboto Mono" w:hAnsi="Roboto Mono"/>
+        </w:rPr>
+        <w:t>4}</w:t>
       </w:r>
       <w:r>
         <w:rPr>
@@ -6377,6 +6442,7 @@
         </w:rPr>
         <w:t>⊇</w:t>
       </w:r>
+      <w:proofErr w:type="gramEnd"/>
       <w:r>
         <w:rPr>
           <w:rFonts w:ascii="Roboto Mono" w:hAnsi="Roboto Mono"/>
@@ -6399,7 +6465,14 @@
         <w:rPr>
           <w:rFonts w:ascii="Roboto Mono" w:hAnsi="Roboto Mono"/>
         </w:rPr>
-        <w:t>{1,2,3}</w:t>
+        <w:t>{1,2,</w:t>
+      </w:r>
+      <w:proofErr w:type="gramStart"/>
+      <w:r>
+        <w:rPr>
+          <w:rFonts w:ascii="Roboto Mono" w:hAnsi="Roboto Mono"/>
+        </w:rPr>
+        <w:t>3}</w:t>
       </w:r>
       <w:r>
         <w:rPr>
@@ -6407,6 +6480,7 @@
         </w:rPr>
         <w:t>⊃</w:t>
       </w:r>
+      <w:proofErr w:type="gramEnd"/>
       <w:r>
         <w:rPr>
           <w:rFonts w:ascii="Roboto Mono" w:hAnsi="Roboto Mono"/>
@@ -6610,7 +6684,21 @@
         <w:rPr>
           <w:rFonts w:ascii="Roboto Mono" w:hAnsi="Roboto Mono"/>
         </w:rPr>
-        <w:t>Finite Set {a,...,z}</w:t>
+        <w:t>Finite Set {</w:t>
+      </w:r>
+      <w:proofErr w:type="gramStart"/>
+      <w:r>
+        <w:rPr>
+          <w:rFonts w:ascii="Roboto Mono" w:hAnsi="Roboto Mono"/>
+        </w:rPr>
+        <w:t>a,...</w:t>
+      </w:r>
+      <w:proofErr w:type="gramEnd"/>
+      <w:r>
+        <w:rPr>
+          <w:rFonts w:ascii="Roboto Mono" w:hAnsi="Roboto Mono"/>
+        </w:rPr>
+        <w:t>,z}</w:t>
       </w:r>
     </w:p>
     <w:p>
@@ -6794,6 +6882,7 @@
         <w:t>x:x</w:t>
       </w:r>
       <w:proofErr w:type="spellEnd"/>
+      <w:proofErr w:type="gramStart"/>
       <w:r>
         <w:rPr>
           <w:rFonts w:ascii="Cambria Math" w:hAnsi="Cambria Math" w:cs="Cambria Math"/>
@@ -6804,7 +6893,14 @@
         <w:rPr>
           <w:rFonts w:ascii="Roboto Mono" w:hAnsi="Roboto Mono"/>
         </w:rPr>
-        <w:t>{1,2,3}} means "The set of all x such that x is in the set {1,2,3}." This set is finite with three elements: 1,2,3.</w:t>
+        <w:t>{</w:t>
+      </w:r>
+      <w:proofErr w:type="gramEnd"/>
+      <w:r>
+        <w:rPr>
+          <w:rFonts w:ascii="Roboto Mono" w:hAnsi="Roboto Mono"/>
+        </w:rPr>
+        <w:t>1,2,3}} means "The set of all x such that x is in the set {1,2,3}." This set is finite with three elements: 1,2,3.</w:t>
       </w:r>
     </w:p>
     <w:p>
@@ -6884,8 +6980,16 @@
         <w:rPr>
           <w:rFonts w:ascii="Roboto Mono" w:hAnsi="Roboto Mono"/>
         </w:rPr>
-        <w:t>P(A)={B:B</w:t>
-      </w:r>
+        <w:t>P(A)={</w:t>
+      </w:r>
+      <w:proofErr w:type="gramStart"/>
+      <w:r>
+        <w:rPr>
+          <w:rFonts w:ascii="Roboto Mono" w:hAnsi="Roboto Mono"/>
+        </w:rPr>
+        <w:t>B:B</w:t>
+      </w:r>
+      <w:proofErr w:type="gramEnd"/>
       <w:r>
         <w:rPr>
           <w:rFonts w:ascii="Cambria Math" w:hAnsi="Cambria Math" w:cs="Cambria Math"/>
@@ -7465,6 +7569,7 @@
         <w:t>={(</w:t>
       </w:r>
       <w:proofErr w:type="spellStart"/>
+      <w:proofErr w:type="gramStart"/>
       <w:r>
         <w:rPr>
           <w:rFonts w:ascii="Roboto Mono" w:hAnsi="Roboto Mono"/>
@@ -7474,6 +7579,7 @@
         <w:t>a,b</w:t>
       </w:r>
       <w:proofErr w:type="spellEnd"/>
+      <w:proofErr w:type="gramEnd"/>
       <w:r>
         <w:rPr>
           <w:rFonts w:ascii="Roboto Mono" w:hAnsi="Roboto Mono"/>
@@ -7637,6 +7743,7 @@
         <w:t>The notation N×N is the set of all ordered pairs (</w:t>
       </w:r>
       <w:proofErr w:type="spellStart"/>
+      <w:proofErr w:type="gramStart"/>
       <w:r>
         <w:rPr>
           <w:rFonts w:ascii="Roboto Mono" w:hAnsi="Roboto Mono"/>
@@ -7644,6 +7751,7 @@
         <w:t>x,y</w:t>
       </w:r>
       <w:proofErr w:type="spellEnd"/>
+      <w:proofErr w:type="gramEnd"/>
       <w:r>
         <w:rPr>
           <w:rFonts w:ascii="Roboto Mono" w:hAnsi="Roboto Mono"/>
@@ -7665,6 +7773,7 @@
         <w:t>R×R={(</w:t>
       </w:r>
       <w:proofErr w:type="spellStart"/>
+      <w:proofErr w:type="gramStart"/>
       <w:r>
         <w:rPr>
           <w:rFonts w:ascii="Roboto Mono" w:hAnsi="Roboto Mono"/>
@@ -7672,6 +7781,7 @@
         <w:t>x,y</w:t>
       </w:r>
       <w:proofErr w:type="spellEnd"/>
+      <w:proofErr w:type="gramEnd"/>
       <w:r>
         <w:rPr>
           <w:rFonts w:ascii="Roboto Mono" w:hAnsi="Roboto Mono"/>
@@ -7760,6 +7870,7 @@
         <w:t>The notation Z×Z is the set of all ordered pairs (</w:t>
       </w:r>
       <w:proofErr w:type="spellStart"/>
+      <w:proofErr w:type="gramStart"/>
       <w:r>
         <w:rPr>
           <w:rFonts w:ascii="Roboto Mono" w:hAnsi="Roboto Mono"/>
@@ -7767,6 +7878,7 @@
         <w:t>x,y</w:t>
       </w:r>
       <w:proofErr w:type="spellEnd"/>
+      <w:proofErr w:type="gramEnd"/>
       <w:r>
         <w:rPr>
           <w:rFonts w:ascii="Roboto Mono" w:hAnsi="Roboto Mono"/>
@@ -7788,6 +7900,7 @@
         <w:t>Z×Z={(</w:t>
       </w:r>
       <w:proofErr w:type="spellStart"/>
+      <w:proofErr w:type="gramStart"/>
       <w:r>
         <w:rPr>
           <w:rFonts w:ascii="Roboto Mono" w:hAnsi="Roboto Mono"/>
@@ -7795,6 +7908,7 @@
         <w:t>x,y</w:t>
       </w:r>
       <w:proofErr w:type="spellEnd"/>
+      <w:proofErr w:type="gramEnd"/>
       <w:r>
         <w:rPr>
           <w:rFonts w:ascii="Roboto Mono" w:hAnsi="Roboto Mono"/>
@@ -7883,6 +7997,7 @@
         <w:t>The notation R×R is the set of all ordered pairs (</w:t>
       </w:r>
       <w:proofErr w:type="spellStart"/>
+      <w:proofErr w:type="gramStart"/>
       <w:r>
         <w:rPr>
           <w:rFonts w:ascii="Roboto Mono" w:hAnsi="Roboto Mono"/>
@@ -7890,6 +8005,7 @@
         <w:t>x,y</w:t>
       </w:r>
       <w:proofErr w:type="spellEnd"/>
+      <w:proofErr w:type="gramEnd"/>
       <w:r>
         <w:rPr>
           <w:rFonts w:ascii="Roboto Mono" w:hAnsi="Roboto Mono"/>
@@ -7911,6 +8027,7 @@
         <w:t>R×R={(</w:t>
       </w:r>
       <w:proofErr w:type="spellStart"/>
+      <w:proofErr w:type="gramStart"/>
       <w:r>
         <w:rPr>
           <w:rFonts w:ascii="Roboto Mono" w:hAnsi="Roboto Mono"/>
@@ -7918,6 +8035,7 @@
         <w:t>x,y</w:t>
       </w:r>
       <w:proofErr w:type="spellEnd"/>
+      <w:proofErr w:type="gramEnd"/>
       <w:r>
         <w:rPr>
           <w:rFonts w:ascii="Roboto Mono" w:hAnsi="Roboto Mono"/>
@@ -8006,6 +8124,7 @@
         <w:t>The notation N×R is the set of all ordered pairs (</w:t>
       </w:r>
       <w:proofErr w:type="spellStart"/>
+      <w:proofErr w:type="gramStart"/>
       <w:r>
         <w:rPr>
           <w:rFonts w:ascii="Roboto Mono" w:hAnsi="Roboto Mono"/>
@@ -8013,6 +8132,7 @@
         <w:t>x,y</w:t>
       </w:r>
       <w:proofErr w:type="spellEnd"/>
+      <w:proofErr w:type="gramEnd"/>
       <w:r>
         <w:rPr>
           <w:rFonts w:ascii="Roboto Mono" w:hAnsi="Roboto Mono"/>
@@ -8034,6 +8154,7 @@
         <w:t>N×R={(</w:t>
       </w:r>
       <w:proofErr w:type="spellStart"/>
+      <w:proofErr w:type="gramStart"/>
       <w:r>
         <w:rPr>
           <w:rFonts w:ascii="Roboto Mono" w:hAnsi="Roboto Mono"/>
@@ -8041,6 +8162,7 @@
         <w:t>n,r</w:t>
       </w:r>
       <w:proofErr w:type="spellEnd"/>
+      <w:proofErr w:type="gramEnd"/>
       <w:r>
         <w:rPr>
           <w:rFonts w:ascii="Roboto Mono" w:hAnsi="Roboto Mono"/>
@@ -8066,12 +8188,14 @@
         </w:rPr>
         <w:t>∈</w:t>
       </w:r>
+      <w:proofErr w:type="gramStart"/>
       <w:r>
         <w:rPr>
           <w:rFonts w:ascii="Roboto Mono" w:hAnsi="Roboto Mono"/>
         </w:rPr>
         <w:t>N,r</w:t>
       </w:r>
+      <w:proofErr w:type="gramEnd"/>
       <w:r>
         <w:rPr>
           <w:rFonts w:ascii="Cambria Math" w:hAnsi="Cambria Math" w:cs="Cambria Math"/>
@@ -8212,6 +8336,7 @@
         <w:t xml:space="preserve"> {(</w:t>
       </w:r>
       <w:proofErr w:type="spellStart"/>
+      <w:proofErr w:type="gramStart"/>
       <w:r>
         <w:rPr>
           <w:rFonts w:ascii="Roboto Mono" w:hAnsi="Roboto Mono"/>
@@ -8223,7 +8348,14 @@
         <w:rPr>
           <w:rFonts w:ascii="Roboto Mono" w:hAnsi="Roboto Mono"/>
         </w:rPr>
-        <w:t>):condition}</w:t>
+        <w:t>):condition</w:t>
+      </w:r>
+      <w:proofErr w:type="gramEnd"/>
+      <w:r>
+        <w:rPr>
+          <w:rFonts w:ascii="Roboto Mono" w:hAnsi="Roboto Mono"/>
+        </w:rPr>
+        <w:t>}</w:t>
       </w:r>
     </w:p>
     <w:p>
@@ -8278,6 +8410,7 @@
         <w:t xml:space="preserve"> {(</w:t>
       </w:r>
       <w:proofErr w:type="spellStart"/>
+      <w:proofErr w:type="gramStart"/>
       <w:r>
         <w:rPr>
           <w:rFonts w:ascii="Roboto Mono" w:hAnsi="Roboto Mono"/>
@@ -8285,6 +8418,7 @@
         <w:t>x,y</w:t>
       </w:r>
       <w:proofErr w:type="spellEnd"/>
+      <w:proofErr w:type="gramEnd"/>
       <w:r>
         <w:rPr>
           <w:rFonts w:ascii="Roboto Mono" w:hAnsi="Roboto Mono"/>
@@ -8292,12 +8426,14 @@
         <w:t xml:space="preserve">):x&gt;y and </w:t>
       </w:r>
       <w:proofErr w:type="spellStart"/>
+      <w:proofErr w:type="gramStart"/>
       <w:r>
         <w:rPr>
           <w:rFonts w:ascii="Roboto Mono" w:hAnsi="Roboto Mono"/>
         </w:rPr>
         <w:t>x,y</w:t>
       </w:r>
+      <w:proofErr w:type="gramEnd"/>
       <w:r>
         <w:rPr>
           <w:rFonts w:ascii="Cambria Math" w:hAnsi="Cambria Math" w:cs="Cambria Math"/>
@@ -8438,11 +8574,19 @@
         <w:t xml:space="preserve"> {</w:t>
       </w:r>
       <w:proofErr w:type="spellStart"/>
-      <w:r>
-        <w:rPr>
-          <w:rFonts w:ascii="Roboto Mono" w:hAnsi="Roboto Mono"/>
-        </w:rPr>
-        <w:t>x,:Equation</w:t>
+      <w:proofErr w:type="gramStart"/>
+      <w:r>
+        <w:rPr>
+          <w:rFonts w:ascii="Roboto Mono" w:hAnsi="Roboto Mono"/>
+        </w:rPr>
+        <w:t>x,:</w:t>
+      </w:r>
+      <w:proofErr w:type="gramEnd"/>
+      <w:r>
+        <w:rPr>
+          <w:rFonts w:ascii="Roboto Mono" w:hAnsi="Roboto Mono"/>
+        </w:rPr>
+        <w:t>Equation</w:t>
       </w:r>
       <w:proofErr w:type="spellEnd"/>
       <w:r>
@@ -8452,11 +8596,19 @@
         <w:t>}, {</w:t>
       </w:r>
       <w:proofErr w:type="spellStart"/>
-      <w:r>
-        <w:rPr>
-          <w:rFonts w:ascii="Roboto Mono" w:hAnsi="Roboto Mono"/>
-        </w:rPr>
-        <w:t>x,:Inequality</w:t>
+      <w:proofErr w:type="gramStart"/>
+      <w:r>
+        <w:rPr>
+          <w:rFonts w:ascii="Roboto Mono" w:hAnsi="Roboto Mono"/>
+        </w:rPr>
+        <w:t>x,:</w:t>
+      </w:r>
+      <w:proofErr w:type="gramEnd"/>
+      <w:r>
+        <w:rPr>
+          <w:rFonts w:ascii="Roboto Mono" w:hAnsi="Roboto Mono"/>
+        </w:rPr>
+        <w:t>Inequality</w:t>
       </w:r>
       <w:proofErr w:type="spellEnd"/>
       <w:r>
@@ -8542,7 +8694,21 @@
         <w:rPr>
           <w:rFonts w:ascii="Roboto Mono" w:hAnsi="Roboto Mono"/>
         </w:rPr>
-        <w:t>−4=0, which is {2,−2}.</w:t>
+        <w:t>−4=0, which is {</w:t>
+      </w:r>
+      <w:proofErr w:type="gramStart"/>
+      <w:r>
+        <w:rPr>
+          <w:rFonts w:ascii="Roboto Mono" w:hAnsi="Roboto Mono"/>
+        </w:rPr>
+        <w:t>2,−</w:t>
+      </w:r>
+      <w:proofErr w:type="gramEnd"/>
+      <w:r>
+        <w:rPr>
+          <w:rFonts w:ascii="Roboto Mono" w:hAnsi="Roboto Mono"/>
+        </w:rPr>
+        <w:t>2}.</w:t>
       </w:r>
     </w:p>
     <w:p>
@@ -8575,6 +8741,7 @@
         </w:rPr>
         <w:t>∈</w:t>
       </w:r>
+      <w:proofErr w:type="gramStart"/>
       <w:r>
         <w:rPr>
           <w:rFonts w:ascii="Roboto Mono" w:hAnsi="Roboto Mono"/>
@@ -8582,6 +8749,7 @@
         <w:t>R,x</w:t>
       </w:r>
       <w:proofErr w:type="spellEnd"/>
+      <w:proofErr w:type="gramEnd"/>
       <w:r>
         <w:rPr>
           <w:rFonts w:ascii="Roboto Mono" w:hAnsi="Roboto Mono"/>
@@ -8778,6 +8946,7 @@
         <w:t>{</w:t>
       </w:r>
       <w:proofErr w:type="spellStart"/>
+      <w:proofErr w:type="gramStart"/>
       <w:r>
         <w:rPr>
           <w:rFonts w:ascii="Roboto Mono" w:hAnsi="Roboto Mono"/>
@@ -8785,6 +8954,7 @@
         <w:t>f:f</w:t>
       </w:r>
       <w:proofErr w:type="spellEnd"/>
+      <w:proofErr w:type="gramEnd"/>
       <w:r>
         <w:rPr>
           <w:rFonts w:ascii="Roboto Mono" w:hAnsi="Roboto Mono"/>
@@ -8810,6 +8980,7 @@
         <w:t>{</w:t>
       </w:r>
       <w:proofErr w:type="spellStart"/>
+      <w:proofErr w:type="gramStart"/>
       <w:r>
         <w:rPr>
           <w:rFonts w:ascii="Roboto Mono" w:hAnsi="Roboto Mono"/>
@@ -8817,6 +8988,7 @@
         <w:t>f:f</w:t>
       </w:r>
       <w:proofErr w:type="spellEnd"/>
+      <w:proofErr w:type="gramEnd"/>
       <w:r>
         <w:rPr>
           <w:rFonts w:ascii="Roboto Mono" w:hAnsi="Roboto Mono"/>
@@ -8906,18 +9078,21 @@
         </w:rPr>
         <w:t>∣</w:t>
       </w:r>
+      <w:proofErr w:type="gramStart"/>
       <w:r>
         <w:rPr>
           <w:rFonts w:ascii="Roboto Mono" w:hAnsi="Roboto Mono"/>
         </w:rPr>
         <w:t>f:R</w:t>
       </w:r>
+      <w:proofErr w:type="gramEnd"/>
       <w:r>
         <w:rPr>
           <w:rFonts w:ascii="Courier New" w:hAnsi="Courier New" w:cs="Courier New"/>
         </w:rPr>
         <w:t>→</w:t>
       </w:r>
+      <w:proofErr w:type="gramStart"/>
       <w:r>
         <w:rPr>
           <w:rFonts w:ascii="Roboto Mono" w:hAnsi="Roboto Mono"/>
@@ -8925,6 +9100,7 @@
         <w:t>R,f</w:t>
       </w:r>
       <w:proofErr w:type="spellEnd"/>
+      <w:proofErr w:type="gramEnd"/>
       <w:r>
         <w:rPr>
           <w:rFonts w:ascii="Roboto Mono" w:hAnsi="Roboto Mono"/>
@@ -8937,12 +9113,14 @@
         </w:rPr>
         <w:t>−</w:t>
       </w:r>
+      <w:proofErr w:type="gramStart"/>
       <w:r>
         <w:rPr>
           <w:rFonts w:ascii="Roboto Mono" w:hAnsi="Roboto Mono"/>
         </w:rPr>
         <w:t>x)=</w:t>
       </w:r>
+      <w:proofErr w:type="gramEnd"/>
       <w:r>
         <w:rPr>
           <w:rFonts w:ascii="Roboto Mono" w:hAnsi="Roboto Mono" w:cs="Roboto Mono"/>
@@ -9015,14 +9193,23 @@
           <w:rFonts w:ascii="Roboto Mono" w:hAnsi="Roboto Mono"/>
         </w:rPr>
         <w:lastRenderedPageBreak/>
-        <w:t>The notation f:R</w:t>
-      </w:r>
+        <w:t xml:space="preserve">The notation </w:t>
+      </w:r>
+      <w:proofErr w:type="gramStart"/>
+      <w:r>
+        <w:rPr>
+          <w:rFonts w:ascii="Roboto Mono" w:hAnsi="Roboto Mono"/>
+        </w:rPr>
+        <w:t>f:R</w:t>
+      </w:r>
+      <w:proofErr w:type="gramEnd"/>
       <w:r>
         <w:rPr>
           <w:rFonts w:ascii="Courier New" w:hAnsi="Courier New" w:cs="Courier New"/>
         </w:rPr>
         <w:t>→</w:t>
       </w:r>
+      <w:proofErr w:type="gramStart"/>
       <w:r>
         <w:rPr>
           <w:rFonts w:ascii="Roboto Mono" w:hAnsi="Roboto Mono"/>
@@ -9039,7 +9226,14 @@
         <w:rPr>
           <w:rFonts w:ascii="Roboto Mono" w:hAnsi="Roboto Mono"/>
         </w:rPr>
-        <w:t xml:space="preserve"> means that f is a function where:</w:t>
+        <w:t xml:space="preserve"> means</w:t>
+      </w:r>
+      <w:proofErr w:type="gramEnd"/>
+      <w:r>
+        <w:rPr>
+          <w:rFonts w:ascii="Roboto Mono" w:hAnsi="Roboto Mono"/>
+        </w:rPr>
+        <w:t xml:space="preserve"> that f is a function where:</w:t>
       </w:r>
     </w:p>
     <w:p>
@@ -9165,6 +9359,7 @@
         <w:t>how can read this {</w:t>
       </w:r>
       <w:proofErr w:type="spellStart"/>
+      <w:proofErr w:type="gramStart"/>
       <w:r>
         <w:rPr>
           <w:rFonts w:ascii="Roboto Mono" w:hAnsi="Roboto Mono"/>
@@ -9172,6 +9367,7 @@
         <w:t>f:f</w:t>
       </w:r>
       <w:proofErr w:type="spellEnd"/>
+      <w:proofErr w:type="gramEnd"/>
       <w:r>
         <w:rPr>
           <w:rFonts w:ascii="Roboto Mono" w:hAnsi="Roboto Mono"/>
@@ -9298,18 +9494,21 @@
         </w:rPr>
         <w:t>∣</w:t>
       </w:r>
+      <w:proofErr w:type="gramStart"/>
       <w:r>
         <w:rPr>
           <w:rFonts w:ascii="Roboto Mono" w:hAnsi="Roboto Mono"/>
         </w:rPr>
         <w:t>f:R</w:t>
       </w:r>
+      <w:proofErr w:type="gramEnd"/>
       <w:r>
         <w:rPr>
           <w:rFonts w:ascii="Courier New" w:hAnsi="Courier New" w:cs="Courier New"/>
         </w:rPr>
         <w:t>→</w:t>
       </w:r>
+      <w:proofErr w:type="gramStart"/>
       <w:r>
         <w:rPr>
           <w:rFonts w:ascii="Roboto Mono" w:hAnsi="Roboto Mono"/>
@@ -9317,6 +9516,7 @@
         <w:t>R,f</w:t>
       </w:r>
       <w:proofErr w:type="spellEnd"/>
+      <w:proofErr w:type="gramEnd"/>
       <w:r>
         <w:rPr>
           <w:rFonts w:ascii="Roboto Mono" w:hAnsi="Roboto Mono"/>
@@ -9329,12 +9529,14 @@
         </w:rPr>
         <w:t>−</w:t>
       </w:r>
+      <w:proofErr w:type="gramStart"/>
       <w:r>
         <w:rPr>
           <w:rFonts w:ascii="Roboto Mono" w:hAnsi="Roboto Mono"/>
         </w:rPr>
         <w:t>x)=</w:t>
       </w:r>
+      <w:proofErr w:type="gramEnd"/>
       <w:r>
         <w:rPr>
           <w:rFonts w:ascii="Roboto Mono" w:hAnsi="Roboto Mono" w:cs="Roboto Mono"/>
@@ -9407,6 +9609,7 @@
         <w:t xml:space="preserve"> such that f is a function from the real numbers to the real numbers (</w:t>
       </w:r>
       <w:proofErr w:type="spellStart"/>
+      <w:proofErr w:type="gramStart"/>
       <w:r>
         <w:rPr>
           <w:rFonts w:ascii="Roboto Mono" w:hAnsi="Roboto Mono"/>
@@ -9415,6 +9618,7 @@
         </w:rPr>
         <w:t>f:R</w:t>
       </w:r>
+      <w:proofErr w:type="gramEnd"/>
       <w:r>
         <w:rPr>
           <w:rFonts w:ascii="Courier New" w:hAnsi="Courier New" w:cs="Courier New"/>
@@ -9448,6 +9652,7 @@
         </w:rPr>
         <w:t>−</w:t>
       </w:r>
+      <w:proofErr w:type="gramStart"/>
       <w:r>
         <w:rPr>
           <w:rFonts w:ascii="Roboto Mono" w:hAnsi="Roboto Mono"/>
@@ -9456,6 +9661,7 @@
         </w:rPr>
         <w:t>x)=</w:t>
       </w:r>
+      <w:proofErr w:type="gramEnd"/>
       <w:r>
         <w:rPr>
           <w:rFonts w:ascii="Roboto Mono" w:hAnsi="Roboto Mono" w:cs="Roboto Mono"/>
@@ -9750,6 +9956,7 @@
         </w:rPr>
         <w:t>∈</w:t>
       </w:r>
+      <w:proofErr w:type="gramStart"/>
       <w:r>
         <w:rPr>
           <w:rFonts w:ascii="Roboto Mono" w:hAnsi="Roboto Mono"/>
@@ -9757,6 +9964,7 @@
         <w:t>N,x</w:t>
       </w:r>
       <w:proofErr w:type="spellEnd"/>
+      <w:proofErr w:type="gramEnd"/>
       <w:r>
         <w:rPr>
           <w:rFonts w:ascii="Roboto Mono" w:hAnsi="Roboto Mono"/>
@@ -9794,6 +10002,7 @@
         </w:rPr>
         <w:t>∈</w:t>
       </w:r>
+      <w:proofErr w:type="gramStart"/>
       <w:r>
         <w:rPr>
           <w:rFonts w:ascii="Roboto Mono" w:hAnsi="Roboto Mono"/>
@@ -9801,11 +10010,40 @@
         <w:t>Z,x</w:t>
       </w:r>
       <w:proofErr w:type="spellEnd"/>
-      <w:r>
-        <w:rPr>
-          <w:rFonts w:ascii="Roboto Mono" w:hAnsi="Roboto Mono"/>
-        </w:rPr>
-        <w:t xml:space="preserve"> is even} represents the set of all even integers {…,−4,−2,0,2,4,…}.</w:t>
+      <w:proofErr w:type="gramEnd"/>
+      <w:r>
+        <w:rPr>
+          <w:rFonts w:ascii="Roboto Mono" w:hAnsi="Roboto Mono"/>
+        </w:rPr>
+        <w:t xml:space="preserve"> is even} represents the set of all even integers {</w:t>
+      </w:r>
+      <w:proofErr w:type="gramStart"/>
+      <w:r>
+        <w:rPr>
+          <w:rFonts w:ascii="Roboto Mono" w:hAnsi="Roboto Mono"/>
+        </w:rPr>
+        <w:t>…,−4,−</w:t>
+      </w:r>
+      <w:proofErr w:type="gramEnd"/>
+      <w:r>
+        <w:rPr>
+          <w:rFonts w:ascii="Roboto Mono" w:hAnsi="Roboto Mono"/>
+        </w:rPr>
+        <w:t>2,0,</w:t>
+      </w:r>
+      <w:proofErr w:type="gramStart"/>
+      <w:r>
+        <w:rPr>
+          <w:rFonts w:ascii="Roboto Mono" w:hAnsi="Roboto Mono"/>
+        </w:rPr>
+        <w:t>2,4,…</w:t>
+      </w:r>
+      <w:proofErr w:type="gramEnd"/>
+      <w:r>
+        <w:rPr>
+          <w:rFonts w:ascii="Roboto Mono" w:hAnsi="Roboto Mono"/>
+        </w:rPr>
+        <w:t>}.</w:t>
       </w:r>
     </w:p>
     <w:p>
@@ -9838,6 +10076,7 @@
         </w:rPr>
         <w:t>∈</w:t>
       </w:r>
+      <w:proofErr w:type="gramStart"/>
       <w:r>
         <w:rPr>
           <w:rFonts w:ascii="Roboto Mono" w:hAnsi="Roboto Mono"/>
@@ -9845,12 +10084,14 @@
         <w:t>Z,x</w:t>
       </w:r>
       <w:proofErr w:type="spellEnd"/>
+      <w:proofErr w:type="gramEnd"/>
       <w:r>
         <w:rPr>
           <w:rFonts w:ascii="Roboto Mono" w:hAnsi="Roboto Mono"/>
         </w:rPr>
         <w:t xml:space="preserve"> is odd} represents the set of all odd integers: {</w:t>
       </w:r>
+      <w:proofErr w:type="gramStart"/>
       <w:r>
         <w:rPr>
           <w:rFonts w:ascii="Roboto Mono" w:hAnsi="Roboto Mono" w:cs="Roboto Mono"/>
@@ -9881,17 +10122,32 @@
         </w:rPr>
         <w:t>−</w:t>
       </w:r>
-      <w:r>
-        <w:rPr>
-          <w:rFonts w:ascii="Roboto Mono" w:hAnsi="Roboto Mono"/>
-        </w:rPr>
-        <w:t>1,1,3,</w:t>
+      <w:proofErr w:type="gramEnd"/>
+      <w:r>
+        <w:rPr>
+          <w:rFonts w:ascii="Roboto Mono" w:hAnsi="Roboto Mono"/>
+        </w:rPr>
+        <w:t>1,</w:t>
+      </w:r>
+      <w:proofErr w:type="gramStart"/>
+      <w:r>
+        <w:rPr>
+          <w:rFonts w:ascii="Roboto Mono" w:hAnsi="Roboto Mono"/>
+        </w:rPr>
+        <w:t>1,3,</w:t>
       </w:r>
       <w:r>
         <w:rPr>
           <w:rFonts w:ascii="Roboto Mono" w:hAnsi="Roboto Mono" w:cs="Roboto Mono"/>
         </w:rPr>
-        <w:t>… </w:t>
+        <w:t>…</w:t>
+      </w:r>
+      <w:proofErr w:type="gramEnd"/>
+      <w:r>
+        <w:rPr>
+          <w:rFonts w:ascii="Roboto Mono" w:hAnsi="Roboto Mono" w:cs="Roboto Mono"/>
+        </w:rPr>
+        <w:t> </w:t>
       </w:r>
       <w:r>
         <w:rPr>
@@ -9930,6 +10186,7 @@
         </w:rPr>
         <w:t>∈</w:t>
       </w:r>
+      <w:proofErr w:type="gramStart"/>
       <w:r>
         <w:rPr>
           <w:rFonts w:ascii="Roboto Mono" w:hAnsi="Roboto Mono"/>
@@ -9937,6 +10194,7 @@
         <w:t>N,x</w:t>
       </w:r>
       <w:proofErr w:type="spellEnd"/>
+      <w:proofErr w:type="gramEnd"/>
       <w:r>
         <w:rPr>
           <w:rFonts w:ascii="Roboto Mono" w:hAnsi="Roboto Mono"/>
@@ -10018,6 +10276,7 @@
         </w:rPr>
         <w:t>∈</w:t>
       </w:r>
+      <w:proofErr w:type="gramStart"/>
       <w:r>
         <w:rPr>
           <w:rFonts w:ascii="Roboto Mono" w:hAnsi="Roboto Mono"/>
@@ -10025,17 +10284,32 @@
         <w:t>N,x</w:t>
       </w:r>
       <w:proofErr w:type="spellEnd"/>
-      <w:r>
-        <w:rPr>
-          <w:rFonts w:ascii="Roboto Mono" w:hAnsi="Roboto Mono"/>
-        </w:rPr>
-        <w:t xml:space="preserve"> is a multiple of 5} represents the set of multiples of 5, i.e., {5,10,15,20,</w:t>
+      <w:proofErr w:type="gramEnd"/>
+      <w:r>
+        <w:rPr>
+          <w:rFonts w:ascii="Roboto Mono" w:hAnsi="Roboto Mono"/>
+        </w:rPr>
+        <w:t xml:space="preserve"> is a multiple of 5} represents the set of multiples of 5, i.e., {5,10,</w:t>
+      </w:r>
+      <w:proofErr w:type="gramStart"/>
+      <w:r>
+        <w:rPr>
+          <w:rFonts w:ascii="Roboto Mono" w:hAnsi="Roboto Mono"/>
+        </w:rPr>
+        <w:t>15,20,</w:t>
       </w:r>
       <w:r>
         <w:rPr>
           <w:rFonts w:ascii="Roboto Mono" w:hAnsi="Roboto Mono" w:cs="Roboto Mono"/>
         </w:rPr>
-        <w:t>… </w:t>
+        <w:t>…</w:t>
+      </w:r>
+      <w:proofErr w:type="gramEnd"/>
+      <w:r>
+        <w:rPr>
+          <w:rFonts w:ascii="Roboto Mono" w:hAnsi="Roboto Mono" w:cs="Roboto Mono"/>
+        </w:rPr>
+        <w:t> </w:t>
       </w:r>
       <w:r>
         <w:rPr>
@@ -10323,8 +10597,16 @@
         <w:rPr>
           <w:rFonts w:ascii="Roboto Mono" w:hAnsi="Roboto Mono"/>
         </w:rPr>
-        <w:t>{A:A</w:t>
-      </w:r>
+        <w:t>{</w:t>
+      </w:r>
+      <w:proofErr w:type="gramStart"/>
+      <w:r>
+        <w:rPr>
+          <w:rFonts w:ascii="Roboto Mono" w:hAnsi="Roboto Mono"/>
+        </w:rPr>
+        <w:t>A:A</w:t>
+      </w:r>
+      <w:proofErr w:type="gramEnd"/>
       <w:r>
         <w:rPr>
           <w:rFonts w:ascii="Cambria Math" w:hAnsi="Cambria Math" w:cs="Cambria Math"/>
@@ -10486,11 +10768,19 @@
         <w:t>{</w:t>
       </w:r>
       <w:proofErr w:type="spellStart"/>
-      <w:r>
-        <w:rPr>
-          <w:rFonts w:ascii="Roboto Mono" w:hAnsi="Roboto Mono"/>
-        </w:rPr>
-        <w:t>f:f:R</w:t>
+      <w:proofErr w:type="gramStart"/>
+      <w:r>
+        <w:rPr>
+          <w:rFonts w:ascii="Roboto Mono" w:hAnsi="Roboto Mono"/>
+        </w:rPr>
+        <w:t>f:f</w:t>
+      </w:r>
+      <w:proofErr w:type="gramEnd"/>
+      <w:r>
+        <w:rPr>
+          <w:rFonts w:ascii="Roboto Mono" w:hAnsi="Roboto Mono"/>
+        </w:rPr>
+        <w:t>:R</w:t>
       </w:r>
       <w:r>
         <w:rPr>
@@ -10512,6 +10802,7 @@
         <w:t xml:space="preserve"> and {</w:t>
       </w:r>
       <w:proofErr w:type="spellStart"/>
+      <w:proofErr w:type="gramStart"/>
       <w:r>
         <w:rPr>
           <w:rFonts w:ascii="Roboto Mono" w:hAnsi="Roboto Mono"/>
@@ -10519,6 +10810,7 @@
         <w:t>x:f</w:t>
       </w:r>
       <w:proofErr w:type="spellEnd"/>
+      <w:proofErr w:type="gramEnd"/>
       <w:r>
         <w:rPr>
           <w:rFonts w:ascii="Roboto Mono" w:hAnsi="Roboto Mono"/>
@@ -10531,11 +10823,19 @@
         </w:rPr>
         <w:t>≥</w:t>
       </w:r>
-      <w:r>
-        <w:rPr>
-          <w:rFonts w:ascii="Roboto Mono" w:hAnsi="Roboto Mono"/>
-        </w:rPr>
-        <w:t>0}=R}</w:t>
+      <w:proofErr w:type="gramStart"/>
+      <w:r>
+        <w:rPr>
+          <w:rFonts w:ascii="Roboto Mono" w:hAnsi="Roboto Mono"/>
+        </w:rPr>
+        <w:t>0}=</w:t>
+      </w:r>
+      <w:proofErr w:type="gramEnd"/>
+      <w:r>
+        <w:rPr>
+          <w:rFonts w:ascii="Roboto Mono" w:hAnsi="Roboto Mono"/>
+        </w:rPr>
+        <w:t>R}</w:t>
       </w:r>
     </w:p>
     <w:p>
@@ -10683,8 +10983,16 @@
         <w:rPr>
           <w:rFonts w:ascii="Roboto Mono" w:hAnsi="Roboto Mono"/>
         </w:rPr>
-        <w:t>{A:A</w:t>
-      </w:r>
+        <w:t>{</w:t>
+      </w:r>
+      <w:proofErr w:type="gramStart"/>
+      <w:r>
+        <w:rPr>
+          <w:rFonts w:ascii="Roboto Mono" w:hAnsi="Roboto Mono"/>
+        </w:rPr>
+        <w:t>A:A</w:t>
+      </w:r>
+      <w:proofErr w:type="gramEnd"/>
       <w:r>
         <w:rPr>
           <w:rFonts w:ascii="Cambria Math" w:hAnsi="Cambria Math" w:cs="Cambria Math"/>
@@ -10937,6 +11245,7 @@
         <w:t>{(</w:t>
       </w:r>
       <w:proofErr w:type="spellStart"/>
+      <w:proofErr w:type="gramStart"/>
       <w:r>
         <w:rPr>
           <w:rFonts w:ascii="Roboto Mono" w:hAnsi="Roboto Mono"/>
@@ -10944,6 +11253,7 @@
         <w:t>x,y</w:t>
       </w:r>
       <w:proofErr w:type="spellEnd"/>
+      <w:proofErr w:type="gramEnd"/>
       <w:r>
         <w:rPr>
           <w:rFonts w:ascii="Roboto Mono" w:hAnsi="Roboto Mono"/>
@@ -10986,19 +11296,35 @@
         <w:rPr>
           <w:rFonts w:ascii="Roboto Mono" w:hAnsi="Roboto Mono"/>
         </w:rPr>
-        <w:t>{z:z</w:t>
-      </w:r>
+        <w:t>{</w:t>
+      </w:r>
+      <w:proofErr w:type="gramStart"/>
+      <w:r>
+        <w:rPr>
+          <w:rFonts w:ascii="Roboto Mono" w:hAnsi="Roboto Mono"/>
+        </w:rPr>
+        <w:t>z:z</w:t>
+      </w:r>
+      <w:proofErr w:type="gramEnd"/>
       <w:r>
         <w:rPr>
           <w:rFonts w:ascii="Cambria Math" w:hAnsi="Cambria Math" w:cs="Cambria Math"/>
         </w:rPr>
         <w:t>∈</w:t>
       </w:r>
-      <w:r>
-        <w:rPr>
-          <w:rFonts w:ascii="Roboto Mono" w:hAnsi="Roboto Mono"/>
-        </w:rPr>
-        <w:t>R,z2=x}}</w:t>
+      <w:proofErr w:type="gramStart"/>
+      <w:r>
+        <w:rPr>
+          <w:rFonts w:ascii="Roboto Mono" w:hAnsi="Roboto Mono"/>
+        </w:rPr>
+        <w:t>R,z</w:t>
+      </w:r>
+      <w:proofErr w:type="gramEnd"/>
+      <w:r>
+        <w:rPr>
+          <w:rFonts w:ascii="Roboto Mono" w:hAnsi="Roboto Mono"/>
+        </w:rPr>
+        <w:t>2=x}}</w:t>
       </w:r>
     </w:p>
     <w:p>
@@ -11014,6 +11340,7 @@
         <w:t>This defines the set of ordered pairs (</w:t>
       </w:r>
       <w:proofErr w:type="spellStart"/>
+      <w:proofErr w:type="gramStart"/>
       <w:r>
         <w:rPr>
           <w:rFonts w:ascii="Roboto Mono" w:hAnsi="Roboto Mono"/>
@@ -11021,6 +11348,7 @@
         <w:t>x,y</w:t>
       </w:r>
       <w:proofErr w:type="spellEnd"/>
+      <w:proofErr w:type="gramEnd"/>
       <w:r>
         <w:rPr>
           <w:rFonts w:ascii="Roboto Mono" w:hAnsi="Roboto Mono"/>
@@ -11708,7 +12036,14 @@
         <w:rPr>
           <w:rFonts w:ascii="Roboto Mono" w:hAnsi="Roboto Mono"/>
         </w:rPr>
-        <w:t>{2,4,6,8,10}</w:t>
+        <w:t>{2,4,6,8,</w:t>
+      </w:r>
+      <w:proofErr w:type="gramStart"/>
+      <w:r>
+        <w:rPr>
+          <w:rFonts w:ascii="Roboto Mono" w:hAnsi="Roboto Mono"/>
+        </w:rPr>
+        <w:t>10}</w:t>
       </w:r>
       <w:r>
         <w:rPr>
@@ -11716,6 +12051,7 @@
         </w:rPr>
         <w:t>→</w:t>
       </w:r>
+      <w:proofErr w:type="gramEnd"/>
       <w:r>
         <w:rPr>
           <w:rFonts w:ascii="Roboto Mono" w:hAnsi="Roboto Mono"/>
@@ -12016,7 +12352,14 @@
         <w:rPr>
           <w:rFonts w:ascii="Roboto Mono" w:hAnsi="Roboto Mono"/>
         </w:rPr>
-        <w:t xml:space="preserve"> is a prime number less than 12}</w:t>
+        <w:t xml:space="preserve"> is a prime number less than </w:t>
+      </w:r>
+      <w:proofErr w:type="gramStart"/>
+      <w:r>
+        <w:rPr>
+          <w:rFonts w:ascii="Roboto Mono" w:hAnsi="Roboto Mono"/>
+        </w:rPr>
+        <w:t>12}</w:t>
       </w:r>
       <w:r>
         <w:rPr>
@@ -12024,6 +12367,7 @@
         </w:rPr>
         <w:t>→</w:t>
       </w:r>
+      <w:proofErr w:type="gramEnd"/>
       <w:r>
         <w:rPr>
           <w:rFonts w:ascii="Roboto Mono" w:hAnsi="Roboto Mono"/>
@@ -14128,7 +14472,35 @@
         <w:rPr>
           <w:rFonts w:ascii="Roboto Mono" w:hAnsi="Roboto Mono"/>
         </w:rPr>
-        <w:t>Vowels = {A,E,I,O,U}</w:t>
+        <w:t>Vowels = {</w:t>
+      </w:r>
+      <w:proofErr w:type="gramStart"/>
+      <w:r>
+        <w:rPr>
+          <w:rFonts w:ascii="Roboto Mono" w:hAnsi="Roboto Mono"/>
+        </w:rPr>
+        <w:t>A,E</w:t>
+      </w:r>
+      <w:proofErr w:type="gramEnd"/>
+      <w:r>
+        <w:rPr>
+          <w:rFonts w:ascii="Roboto Mono" w:hAnsi="Roboto Mono"/>
+        </w:rPr>
+        <w:t>,</w:t>
+      </w:r>
+      <w:proofErr w:type="gramStart"/>
+      <w:r>
+        <w:rPr>
+          <w:rFonts w:ascii="Roboto Mono" w:hAnsi="Roboto Mono"/>
+        </w:rPr>
+        <w:t>I,O</w:t>
+      </w:r>
+      <w:proofErr w:type="gramEnd"/>
+      <w:r>
+        <w:rPr>
+          <w:rFonts w:ascii="Roboto Mono" w:hAnsi="Roboto Mono"/>
+        </w:rPr>
+        <w:t>,U}</w:t>
       </w:r>
     </w:p>
     <w:p>
@@ -14872,7 +15244,21 @@
         <w:rPr>
           <w:rFonts w:ascii="Roboto Mono" w:hAnsi="Roboto Mono"/>
         </w:rPr>
-        <w:t>{1,2,3,4,...}</w:t>
+        <w:t>{1,2,</w:t>
+      </w:r>
+      <w:proofErr w:type="gramStart"/>
+      <w:r>
+        <w:rPr>
+          <w:rFonts w:ascii="Roboto Mono" w:hAnsi="Roboto Mono"/>
+        </w:rPr>
+        <w:t>3,4,...</w:t>
+      </w:r>
+      <w:proofErr w:type="gramEnd"/>
+      <w:r>
+        <w:rPr>
+          <w:rFonts w:ascii="Roboto Mono" w:hAnsi="Roboto Mono"/>
+        </w:rPr>
+        <w:t>}</w:t>
       </w:r>
     </w:p>
     <w:p>
@@ -15012,7 +15398,21 @@
         <w:rPr>
           <w:rFonts w:ascii="Roboto Mono" w:hAnsi="Roboto Mono"/>
         </w:rPr>
-        <w:t>{2,4,6,8,...}</w:t>
+        <w:t>{2,4,</w:t>
+      </w:r>
+      <w:proofErr w:type="gramStart"/>
+      <w:r>
+        <w:rPr>
+          <w:rFonts w:ascii="Roboto Mono" w:hAnsi="Roboto Mono"/>
+        </w:rPr>
+        <w:t>6,8,...</w:t>
+      </w:r>
+      <w:proofErr w:type="gramEnd"/>
+      <w:r>
+        <w:rPr>
+          <w:rFonts w:ascii="Roboto Mono" w:hAnsi="Roboto Mono"/>
+        </w:rPr>
+        <w:t>}</w:t>
       </w:r>
     </w:p>
     <w:p>
@@ -15140,7 +15540,21 @@
           <w:rFonts w:ascii="Roboto Mono" w:hAnsi="Roboto Mono"/>
         </w:rPr>
         <w:lastRenderedPageBreak/>
-        <w:t>{2,3,5,7,11,...}</w:t>
+        <w:t>{2,3,5,</w:t>
+      </w:r>
+      <w:proofErr w:type="gramStart"/>
+      <w:r>
+        <w:rPr>
+          <w:rFonts w:ascii="Roboto Mono" w:hAnsi="Roboto Mono"/>
+        </w:rPr>
+        <w:t>7,11,...</w:t>
+      </w:r>
+      <w:proofErr w:type="gramEnd"/>
+      <w:r>
+        <w:rPr>
+          <w:rFonts w:ascii="Roboto Mono" w:hAnsi="Roboto Mono"/>
+        </w:rPr>
+        <w:t>}</w:t>
       </w:r>
     </w:p>
     <w:p>
@@ -15686,7 +16100,21 @@
               <w:rPr>
                 <w:rFonts w:ascii="Roboto Mono" w:hAnsi="Roboto Mono"/>
               </w:rPr>
-              <w:t>{2,4,6,8,...}</w:t>
+              <w:t>{2,4,</w:t>
+            </w:r>
+            <w:proofErr w:type="gramStart"/>
+            <w:r>
+              <w:rPr>
+                <w:rFonts w:ascii="Roboto Mono" w:hAnsi="Roboto Mono"/>
+              </w:rPr>
+              <w:t>6,8,...</w:t>
+            </w:r>
+            <w:proofErr w:type="gramEnd"/>
+            <w:r>
+              <w:rPr>
+                <w:rFonts w:ascii="Roboto Mono" w:hAnsi="Roboto Mono"/>
+              </w:rPr>
+              <w:t>}</w:t>
             </w:r>
           </w:p>
         </w:tc>
@@ -16957,7 +17385,21 @@
         <w:rPr>
           <w:rFonts w:ascii="Roboto Mono" w:hAnsi="Roboto Mono"/>
         </w:rPr>
-        <w:t>|    |  A        |      |</w:t>
+        <w:t xml:space="preserve">|    </w:t>
+      </w:r>
+      <w:proofErr w:type="gramStart"/>
+      <w:r>
+        <w:rPr>
+          <w:rFonts w:ascii="Roboto Mono" w:hAnsi="Roboto Mono"/>
+        </w:rPr>
+        <w:t>|  A</w:t>
+      </w:r>
+      <w:proofErr w:type="gramEnd"/>
+      <w:r>
+        <w:rPr>
+          <w:rFonts w:ascii="Roboto Mono" w:hAnsi="Roboto Mono"/>
+        </w:rPr>
+        <w:t xml:space="preserve">        |      |</w:t>
       </w:r>
     </w:p>
     <w:p>
@@ -17615,7 +18057,7 @@
         </w:rPr>
         <w:lastRenderedPageBreak/>
         <w:drawing>
-          <wp:inline distT="0" distB="0" distL="0" distR="0" wp14:anchorId="3AFEA479" wp14:editId="11AEA094">
+          <wp:inline distT="0" distB="0" distL="0" distR="0" wp14:anchorId="3AFEA479" wp14:editId="6A730D68">
             <wp:extent cx="3860165" cy="6061030"/>
             <wp:effectExtent l="0" t="0" r="6985" b="0"/>
             <wp:docPr id="14" name="Picture 14"/>
@@ -18003,7 +18445,21 @@
               <w:rPr>
                 <w:rFonts w:ascii="Roboto Mono" w:hAnsi="Roboto Mono"/>
               </w:rPr>
-              <w:t xml:space="preserve">{1,2,3,...} </w:t>
+              <w:t>{1,</w:t>
+            </w:r>
+            <w:proofErr w:type="gramStart"/>
+            <w:r>
+              <w:rPr>
+                <w:rFonts w:ascii="Roboto Mono" w:hAnsi="Roboto Mono"/>
+              </w:rPr>
+              <w:t>2,3,...</w:t>
+            </w:r>
+            <w:proofErr w:type="gramEnd"/>
+            <w:r>
+              <w:rPr>
+                <w:rFonts w:ascii="Roboto Mono" w:hAnsi="Roboto Mono"/>
+              </w:rPr>
+              <w:t xml:space="preserve">} </w:t>
             </w:r>
             <w:r>
               <w:rPr>
@@ -18078,7 +18534,21 @@
               <w:rPr>
                 <w:rFonts w:ascii="Roboto Mono" w:hAnsi="Roboto Mono"/>
               </w:rPr>
-              <w:t>{0,1,2,3,...}</w:t>
+              <w:t>{0,1,</w:t>
+            </w:r>
+            <w:proofErr w:type="gramStart"/>
+            <w:r>
+              <w:rPr>
+                <w:rFonts w:ascii="Roboto Mono" w:hAnsi="Roboto Mono"/>
+              </w:rPr>
+              <w:t>2,3,...</w:t>
+            </w:r>
+            <w:proofErr w:type="gramEnd"/>
+            <w:r>
+              <w:rPr>
+                <w:rFonts w:ascii="Roboto Mono" w:hAnsi="Roboto Mono"/>
+              </w:rPr>
+              <w:t>}</w:t>
             </w:r>
           </w:p>
         </w:tc>
@@ -18145,7 +18615,35 @@
               <w:rPr>
                 <w:rFonts w:ascii="Roboto Mono" w:hAnsi="Roboto Mono"/>
               </w:rPr>
-              <w:t>{...,-2,-1,0,1,2,...}</w:t>
+              <w:t>{</w:t>
+            </w:r>
+            <w:proofErr w:type="gramStart"/>
+            <w:r>
+              <w:rPr>
+                <w:rFonts w:ascii="Roboto Mono" w:hAnsi="Roboto Mono"/>
+              </w:rPr>
+              <w:t>...,-2,-</w:t>
+            </w:r>
+            <w:proofErr w:type="gramEnd"/>
+            <w:r>
+              <w:rPr>
+                <w:rFonts w:ascii="Roboto Mono" w:hAnsi="Roboto Mono"/>
+              </w:rPr>
+              <w:t>1,0,</w:t>
+            </w:r>
+            <w:proofErr w:type="gramStart"/>
+            <w:r>
+              <w:rPr>
+                <w:rFonts w:ascii="Roboto Mono" w:hAnsi="Roboto Mono"/>
+              </w:rPr>
+              <w:t>1,2,...</w:t>
+            </w:r>
+            <w:proofErr w:type="gramEnd"/>
+            <w:r>
+              <w:rPr>
+                <w:rFonts w:ascii="Roboto Mono" w:hAnsi="Roboto Mono"/>
+              </w:rPr>
+              <w:t>}</w:t>
             </w:r>
           </w:p>
         </w:tc>
@@ -18961,7 +19459,21 @@
               <w:rPr>
                 <w:rFonts w:ascii="Roboto Mono" w:hAnsi="Roboto Mono"/>
               </w:rPr>
-              <w:t>{1,2,3,4,...}</w:t>
+              <w:t>{1,2,</w:t>
+            </w:r>
+            <w:proofErr w:type="gramStart"/>
+            <w:r>
+              <w:rPr>
+                <w:rFonts w:ascii="Roboto Mono" w:hAnsi="Roboto Mono"/>
+              </w:rPr>
+              <w:t>3,4,...</w:t>
+            </w:r>
+            <w:proofErr w:type="gramEnd"/>
+            <w:r>
+              <w:rPr>
+                <w:rFonts w:ascii="Roboto Mono" w:hAnsi="Roboto Mono"/>
+              </w:rPr>
+              <w:t>}</w:t>
             </w:r>
           </w:p>
         </w:tc>
@@ -19026,7 +19538,21 @@
               <w:rPr>
                 <w:rFonts w:ascii="Roboto Mono" w:hAnsi="Roboto Mono"/>
               </w:rPr>
-              <w:t>{-1,-2,-3,-4,...}</w:t>
+              <w:t>{-</w:t>
+            </w:r>
+            <w:proofErr w:type="gramStart"/>
+            <w:r>
+              <w:rPr>
+                <w:rFonts w:ascii="Roboto Mono" w:hAnsi="Roboto Mono"/>
+              </w:rPr>
+              <w:t>1,-2,-3,-4,...</w:t>
+            </w:r>
+            <w:proofErr w:type="gramEnd"/>
+            <w:r>
+              <w:rPr>
+                <w:rFonts w:ascii="Roboto Mono" w:hAnsi="Roboto Mono"/>
+              </w:rPr>
+              <w:t>}</w:t>
             </w:r>
           </w:p>
         </w:tc>
@@ -19091,7 +19617,21 @@
               <w:rPr>
                 <w:rFonts w:ascii="Roboto Mono" w:hAnsi="Roboto Mono"/>
               </w:rPr>
-              <w:t>{0,1,2,3,...}</w:t>
+              <w:t>{0,1,</w:t>
+            </w:r>
+            <w:proofErr w:type="gramStart"/>
+            <w:r>
+              <w:rPr>
+                <w:rFonts w:ascii="Roboto Mono" w:hAnsi="Roboto Mono"/>
+              </w:rPr>
+              <w:t>2,3,...</w:t>
+            </w:r>
+            <w:proofErr w:type="gramEnd"/>
+            <w:r>
+              <w:rPr>
+                <w:rFonts w:ascii="Roboto Mono" w:hAnsi="Roboto Mono"/>
+              </w:rPr>
+              <w:t>}</w:t>
             </w:r>
           </w:p>
         </w:tc>
@@ -19156,7 +19696,21 @@
               <w:rPr>
                 <w:rFonts w:ascii="Roboto Mono" w:hAnsi="Roboto Mono"/>
               </w:rPr>
-              <w:t>{..., -3,-2,-1,0}</w:t>
+              <w:t>{..., -</w:t>
+            </w:r>
+            <w:proofErr w:type="gramStart"/>
+            <w:r>
+              <w:rPr>
+                <w:rFonts w:ascii="Roboto Mono" w:hAnsi="Roboto Mono"/>
+              </w:rPr>
+              <w:t>3,-2,-</w:t>
+            </w:r>
+            <w:proofErr w:type="gramEnd"/>
+            <w:r>
+              <w:rPr>
+                <w:rFonts w:ascii="Roboto Mono" w:hAnsi="Roboto Mono"/>
+              </w:rPr>
+              <w:t>1,0}</w:t>
             </w:r>
           </w:p>
         </w:tc>
@@ -19221,7 +19775,35 @@
               <w:rPr>
                 <w:rFonts w:ascii="Roboto Mono" w:hAnsi="Roboto Mono"/>
               </w:rPr>
-              <w:t>{..., -4,-2,0,2,4,...}</w:t>
+              <w:t>{..., -</w:t>
+            </w:r>
+            <w:proofErr w:type="gramStart"/>
+            <w:r>
+              <w:rPr>
+                <w:rFonts w:ascii="Roboto Mono" w:hAnsi="Roboto Mono"/>
+              </w:rPr>
+              <w:t>4,-</w:t>
+            </w:r>
+            <w:proofErr w:type="gramEnd"/>
+            <w:r>
+              <w:rPr>
+                <w:rFonts w:ascii="Roboto Mono" w:hAnsi="Roboto Mono"/>
+              </w:rPr>
+              <w:t>2,0,</w:t>
+            </w:r>
+            <w:proofErr w:type="gramStart"/>
+            <w:r>
+              <w:rPr>
+                <w:rFonts w:ascii="Roboto Mono" w:hAnsi="Roboto Mono"/>
+              </w:rPr>
+              <w:t>2,4,...</w:t>
+            </w:r>
+            <w:proofErr w:type="gramEnd"/>
+            <w:r>
+              <w:rPr>
+                <w:rFonts w:ascii="Roboto Mono" w:hAnsi="Roboto Mono"/>
+              </w:rPr>
+              <w:t>}</w:t>
             </w:r>
           </w:p>
         </w:tc>
@@ -19287,7 +19869,35 @@
               <w:rPr>
                 <w:rFonts w:ascii="Roboto Mono" w:hAnsi="Roboto Mono"/>
               </w:rPr>
-              <w:t>{..., -3,-1,1,3,5,...}</w:t>
+              <w:t>{..., -</w:t>
+            </w:r>
+            <w:proofErr w:type="gramStart"/>
+            <w:r>
+              <w:rPr>
+                <w:rFonts w:ascii="Roboto Mono" w:hAnsi="Roboto Mono"/>
+              </w:rPr>
+              <w:t>3,-</w:t>
+            </w:r>
+            <w:proofErr w:type="gramEnd"/>
+            <w:r>
+              <w:rPr>
+                <w:rFonts w:ascii="Roboto Mono" w:hAnsi="Roboto Mono"/>
+              </w:rPr>
+              <w:t>1,1,</w:t>
+            </w:r>
+            <w:proofErr w:type="gramStart"/>
+            <w:r>
+              <w:rPr>
+                <w:rFonts w:ascii="Roboto Mono" w:hAnsi="Roboto Mono"/>
+              </w:rPr>
+              <w:t>3,5,...</w:t>
+            </w:r>
+            <w:proofErr w:type="gramEnd"/>
+            <w:r>
+              <w:rPr>
+                <w:rFonts w:ascii="Roboto Mono" w:hAnsi="Roboto Mono"/>
+              </w:rPr>
+              <w:t>}</w:t>
             </w:r>
           </w:p>
         </w:tc>
@@ -19352,7 +19962,21 @@
               <w:rPr>
                 <w:rFonts w:ascii="Roboto Mono" w:hAnsi="Roboto Mono"/>
               </w:rPr>
-              <w:t>{2,3,5,7,11,...}</w:t>
+              <w:t>{2,3,5,</w:t>
+            </w:r>
+            <w:proofErr w:type="gramStart"/>
+            <w:r>
+              <w:rPr>
+                <w:rFonts w:ascii="Roboto Mono" w:hAnsi="Roboto Mono"/>
+              </w:rPr>
+              <w:t>7,11,...</w:t>
+            </w:r>
+            <w:proofErr w:type="gramEnd"/>
+            <w:r>
+              <w:rPr>
+                <w:rFonts w:ascii="Roboto Mono" w:hAnsi="Roboto Mono"/>
+              </w:rPr>
+              <w:t>}</w:t>
             </w:r>
           </w:p>
         </w:tc>
@@ -19417,7 +20041,21 @@
               <w:rPr>
                 <w:rFonts w:ascii="Roboto Mono" w:hAnsi="Roboto Mono"/>
               </w:rPr>
-              <w:t>{4,6,8,9,10,...}</w:t>
+              <w:t>{4,6,8,</w:t>
+            </w:r>
+            <w:proofErr w:type="gramStart"/>
+            <w:r>
+              <w:rPr>
+                <w:rFonts w:ascii="Roboto Mono" w:hAnsi="Roboto Mono"/>
+              </w:rPr>
+              <w:t>9,10,...</w:t>
+            </w:r>
+            <w:proofErr w:type="gramEnd"/>
+            <w:r>
+              <w:rPr>
+                <w:rFonts w:ascii="Roboto Mono" w:hAnsi="Roboto Mono"/>
+              </w:rPr>
+              <w:t>}</w:t>
             </w:r>
           </w:p>
         </w:tc>
@@ -19482,7 +20120,35 @@
               <w:rPr>
                 <w:rFonts w:ascii="Roboto Mono" w:hAnsi="Roboto Mono"/>
               </w:rPr>
-              <w:t>{..., -6,-3,0,3,6,9,...}</w:t>
+              <w:t>{..., -</w:t>
+            </w:r>
+            <w:proofErr w:type="gramStart"/>
+            <w:r>
+              <w:rPr>
+                <w:rFonts w:ascii="Roboto Mono" w:hAnsi="Roboto Mono"/>
+              </w:rPr>
+              <w:t>6,-</w:t>
+            </w:r>
+            <w:proofErr w:type="gramEnd"/>
+            <w:r>
+              <w:rPr>
+                <w:rFonts w:ascii="Roboto Mono" w:hAnsi="Roboto Mono"/>
+              </w:rPr>
+              <w:t>3,0,3,</w:t>
+            </w:r>
+            <w:proofErr w:type="gramStart"/>
+            <w:r>
+              <w:rPr>
+                <w:rFonts w:ascii="Roboto Mono" w:hAnsi="Roboto Mono"/>
+              </w:rPr>
+              <w:t>6,9,...</w:t>
+            </w:r>
+            <w:proofErr w:type="gramEnd"/>
+            <w:r>
+              <w:rPr>
+                <w:rFonts w:ascii="Roboto Mono" w:hAnsi="Roboto Mono"/>
+              </w:rPr>
+              <w:t>}</w:t>
             </w:r>
           </w:p>
         </w:tc>
@@ -19547,7 +20213,35 @@
               <w:rPr>
                 <w:rFonts w:ascii="Roboto Mono" w:hAnsi="Roboto Mono"/>
               </w:rPr>
-              <w:t>{..., -10,-5,0,5,10,...}</w:t>
+              <w:t>{..., -</w:t>
+            </w:r>
+            <w:proofErr w:type="gramStart"/>
+            <w:r>
+              <w:rPr>
+                <w:rFonts w:ascii="Roboto Mono" w:hAnsi="Roboto Mono"/>
+              </w:rPr>
+              <w:t>10,-</w:t>
+            </w:r>
+            <w:proofErr w:type="gramEnd"/>
+            <w:r>
+              <w:rPr>
+                <w:rFonts w:ascii="Roboto Mono" w:hAnsi="Roboto Mono"/>
+              </w:rPr>
+              <w:t>5,0,</w:t>
+            </w:r>
+            <w:proofErr w:type="gramStart"/>
+            <w:r>
+              <w:rPr>
+                <w:rFonts w:ascii="Roboto Mono" w:hAnsi="Roboto Mono"/>
+              </w:rPr>
+              <w:t>5,10,...</w:t>
+            </w:r>
+            <w:proofErr w:type="gramEnd"/>
+            <w:r>
+              <w:rPr>
+                <w:rFonts w:ascii="Roboto Mono" w:hAnsi="Roboto Mono"/>
+              </w:rPr>
+              <w:t>}</w:t>
             </w:r>
           </w:p>
         </w:tc>
@@ -19612,7 +20306,21 @@
               <w:rPr>
                 <w:rFonts w:ascii="Roboto Mono" w:hAnsi="Roboto Mono"/>
               </w:rPr>
-              <w:t>{0,1,4,9,16,25,...}</w:t>
+              <w:t>{0,1,4,9,</w:t>
+            </w:r>
+            <w:proofErr w:type="gramStart"/>
+            <w:r>
+              <w:rPr>
+                <w:rFonts w:ascii="Roboto Mono" w:hAnsi="Roboto Mono"/>
+              </w:rPr>
+              <w:t>16,25,...</w:t>
+            </w:r>
+            <w:proofErr w:type="gramEnd"/>
+            <w:r>
+              <w:rPr>
+                <w:rFonts w:ascii="Roboto Mono" w:hAnsi="Roboto Mono"/>
+              </w:rPr>
+              <w:t>}</w:t>
             </w:r>
           </w:p>
         </w:tc>
@@ -19677,7 +20385,35 @@
               <w:rPr>
                 <w:rFonts w:ascii="Roboto Mono" w:hAnsi="Roboto Mono"/>
               </w:rPr>
-              <w:t>{..., -27,-8,-1,0,1,8,27,...}</w:t>
+              <w:t>{..., -</w:t>
+            </w:r>
+            <w:proofErr w:type="gramStart"/>
+            <w:r>
+              <w:rPr>
+                <w:rFonts w:ascii="Roboto Mono" w:hAnsi="Roboto Mono"/>
+              </w:rPr>
+              <w:t>27,-8,-</w:t>
+            </w:r>
+            <w:proofErr w:type="gramEnd"/>
+            <w:r>
+              <w:rPr>
+                <w:rFonts w:ascii="Roboto Mono" w:hAnsi="Roboto Mono"/>
+              </w:rPr>
+              <w:t>1,0,1,</w:t>
+            </w:r>
+            <w:proofErr w:type="gramStart"/>
+            <w:r>
+              <w:rPr>
+                <w:rFonts w:ascii="Roboto Mono" w:hAnsi="Roboto Mono"/>
+              </w:rPr>
+              <w:t>8,27,...</w:t>
+            </w:r>
+            <w:proofErr w:type="gramEnd"/>
+            <w:r>
+              <w:rPr>
+                <w:rFonts w:ascii="Roboto Mono" w:hAnsi="Roboto Mono"/>
+              </w:rPr>
+              <w:t>}</w:t>
             </w:r>
           </w:p>
         </w:tc>
@@ -19943,15 +20679,35 @@
         <w:t>: {</w:t>
       </w:r>
       <w:proofErr w:type="spellStart"/>
+      <w:proofErr w:type="gramStart"/>
       <w:r>
         <w:rPr>
           <w:rFonts w:ascii="Roboto Mono" w:eastAsia="Arial" w:hAnsi="Roboto Mono" w:cs="Arial"/>
           <w:color w:val="000000"/>
           <w:szCs w:val="36"/>
         </w:rPr>
-        <w:t>milk,bread,eggs,butter</w:t>
+        <w:t>milk,bread</w:t>
+      </w:r>
+      <w:proofErr w:type="gramEnd"/>
+      <w:r>
+        <w:rPr>
+          <w:rFonts w:ascii="Roboto Mono" w:eastAsia="Arial" w:hAnsi="Roboto Mono" w:cs="Arial"/>
+          <w:color w:val="000000"/>
+          <w:szCs w:val="36"/>
+        </w:rPr>
+        <w:t>,</w:t>
+      </w:r>
+      <w:proofErr w:type="gramStart"/>
+      <w:r>
+        <w:rPr>
+          <w:rFonts w:ascii="Roboto Mono" w:eastAsia="Arial" w:hAnsi="Roboto Mono" w:cs="Arial"/>
+          <w:color w:val="000000"/>
+          <w:szCs w:val="36"/>
+        </w:rPr>
+        <w:t>eggs,butter</w:t>
       </w:r>
       <w:proofErr w:type="spellEnd"/>
+      <w:proofErr w:type="gramEnd"/>
       <w:r>
         <w:rPr>
           <w:rFonts w:ascii="Roboto Mono" w:eastAsia="Arial" w:hAnsi="Roboto Mono" w:cs="Arial"/>
@@ -20046,15 +20802,35 @@
         <w:t>: {</w:t>
       </w:r>
       <w:proofErr w:type="spellStart"/>
+      <w:proofErr w:type="gramStart"/>
       <w:r>
         <w:rPr>
           <w:rFonts w:ascii="Roboto Mono" w:eastAsia="Arial" w:hAnsi="Roboto Mono" w:cs="Arial"/>
           <w:color w:val="000000"/>
           <w:szCs w:val="36"/>
         </w:rPr>
-        <w:t>Alice,Bob,Charlie,Diana</w:t>
+        <w:t>Alice,Bob</w:t>
+      </w:r>
+      <w:proofErr w:type="gramEnd"/>
+      <w:r>
+        <w:rPr>
+          <w:rFonts w:ascii="Roboto Mono" w:eastAsia="Arial" w:hAnsi="Roboto Mono" w:cs="Arial"/>
+          <w:color w:val="000000"/>
+          <w:szCs w:val="36"/>
+        </w:rPr>
+        <w:t>,</w:t>
+      </w:r>
+      <w:proofErr w:type="gramStart"/>
+      <w:r>
+        <w:rPr>
+          <w:rFonts w:ascii="Roboto Mono" w:eastAsia="Arial" w:hAnsi="Roboto Mono" w:cs="Arial"/>
+          <w:color w:val="000000"/>
+          <w:szCs w:val="36"/>
+        </w:rPr>
+        <w:t>Charlie,Diana</w:t>
       </w:r>
       <w:proofErr w:type="spellEnd"/>
+      <w:proofErr w:type="gramEnd"/>
       <w:r>
         <w:rPr>
           <w:rFonts w:ascii="Roboto Mono" w:eastAsia="Arial" w:hAnsi="Roboto Mono" w:cs="Arial"/>
@@ -20231,7 +21007,25 @@
           <w:color w:val="000000"/>
           <w:szCs w:val="36"/>
         </w:rPr>
-        <w:t>: {player1,player2,player3,…}</w:t>
+        <w:t>: {player</w:t>
+      </w:r>
+      <w:proofErr w:type="gramStart"/>
+      <w:r>
+        <w:rPr>
+          <w:rFonts w:ascii="Roboto Mono" w:eastAsia="Arial" w:hAnsi="Roboto Mono" w:cs="Arial"/>
+          <w:color w:val="000000"/>
+          <w:szCs w:val="36"/>
+        </w:rPr>
+        <w:t>1,player2,player3,…</w:t>
+      </w:r>
+      <w:proofErr w:type="gramEnd"/>
+      <w:r>
+        <w:rPr>
+          <w:rFonts w:ascii="Roboto Mono" w:eastAsia="Arial" w:hAnsi="Roboto Mono" w:cs="Arial"/>
+          <w:color w:val="000000"/>
+          <w:szCs w:val="36"/>
+        </w:rPr>
+        <w:t>}</w:t>
       </w:r>
     </w:p>
     <w:p>
@@ -20440,15 +21234,35 @@
         <w:t>: {</w:t>
       </w:r>
       <w:proofErr w:type="spellStart"/>
+      <w:proofErr w:type="gramStart"/>
       <w:r>
         <w:rPr>
           <w:rFonts w:ascii="Roboto Mono" w:eastAsia="Arial" w:hAnsi="Roboto Mono" w:cs="Arial"/>
           <w:color w:val="000000"/>
           <w:szCs w:val="36"/>
         </w:rPr>
-        <w:t>father,mother,son,daughter</w:t>
+        <w:t>father,mother</w:t>
+      </w:r>
+      <w:proofErr w:type="gramEnd"/>
+      <w:r>
+        <w:rPr>
+          <w:rFonts w:ascii="Roboto Mono" w:eastAsia="Arial" w:hAnsi="Roboto Mono" w:cs="Arial"/>
+          <w:color w:val="000000"/>
+          <w:szCs w:val="36"/>
+        </w:rPr>
+        <w:t>,</w:t>
+      </w:r>
+      <w:proofErr w:type="gramStart"/>
+      <w:r>
+        <w:rPr>
+          <w:rFonts w:ascii="Roboto Mono" w:eastAsia="Arial" w:hAnsi="Roboto Mono" w:cs="Arial"/>
+          <w:color w:val="000000"/>
+          <w:szCs w:val="36"/>
+        </w:rPr>
+        <w:t>son,daughter</w:t>
       </w:r>
       <w:proofErr w:type="spellEnd"/>
+      <w:proofErr w:type="gramEnd"/>
       <w:r>
         <w:rPr>
           <w:rFonts w:ascii="Roboto Mono" w:eastAsia="Arial" w:hAnsi="Roboto Mono" w:cs="Arial"/>
@@ -20543,13 +21357,23 @@
         <w:t>: {</w:t>
       </w:r>
       <w:proofErr w:type="spellStart"/>
+      <w:proofErr w:type="gramStart"/>
       <w:r>
         <w:rPr>
           <w:rFonts w:ascii="Roboto Mono" w:eastAsia="Arial" w:hAnsi="Roboto Mono" w:cs="Arial"/>
           <w:color w:val="000000"/>
           <w:szCs w:val="36"/>
         </w:rPr>
-        <w:t>Paris,Rome,Berlin</w:t>
+        <w:t>Paris,Rome</w:t>
+      </w:r>
+      <w:proofErr w:type="gramEnd"/>
+      <w:r>
+        <w:rPr>
+          <w:rFonts w:ascii="Roboto Mono" w:eastAsia="Arial" w:hAnsi="Roboto Mono" w:cs="Arial"/>
+          <w:color w:val="000000"/>
+          <w:szCs w:val="36"/>
+        </w:rPr>
+        <w:t>,Berlin</w:t>
       </w:r>
       <w:proofErr w:type="spellEnd"/>
       <w:r>
@@ -20644,7 +21468,25 @@
           <w:color w:val="000000"/>
           <w:szCs w:val="36"/>
         </w:rPr>
-        <w:t>: {contact1@example.com,contact2@example.com}</w:t>
+        <w:t xml:space="preserve">: </w:t>
+      </w:r>
+      <w:proofErr w:type="gramStart"/>
+      <w:r>
+        <w:rPr>
+          <w:rFonts w:ascii="Roboto Mono" w:eastAsia="Arial" w:hAnsi="Roboto Mono" w:cs="Arial"/>
+          <w:color w:val="000000"/>
+          <w:szCs w:val="36"/>
+        </w:rPr>
+        <w:t>{contact1@example.com,contact2@example.com</w:t>
+      </w:r>
+      <w:proofErr w:type="gramEnd"/>
+      <w:r>
+        <w:rPr>
+          <w:rFonts w:ascii="Roboto Mono" w:eastAsia="Arial" w:hAnsi="Roboto Mono" w:cs="Arial"/>
+          <w:color w:val="000000"/>
+          <w:szCs w:val="36"/>
+        </w:rPr>
+        <w:t>}</w:t>
       </w:r>
     </w:p>
     <w:p>
@@ -20729,7 +21571,25 @@
           <w:color w:val="000000"/>
           <w:szCs w:val="36"/>
         </w:rPr>
-        <w:t>: {friend1,friend2,friend3}</w:t>
+        <w:t>: {friend</w:t>
+      </w:r>
+      <w:proofErr w:type="gramStart"/>
+      <w:r>
+        <w:rPr>
+          <w:rFonts w:ascii="Roboto Mono" w:eastAsia="Arial" w:hAnsi="Roboto Mono" w:cs="Arial"/>
+          <w:color w:val="000000"/>
+          <w:szCs w:val="36"/>
+        </w:rPr>
+        <w:t>1,friend2,friend</w:t>
+      </w:r>
+      <w:proofErr w:type="gramEnd"/>
+      <w:r>
+        <w:rPr>
+          <w:rFonts w:ascii="Roboto Mono" w:eastAsia="Arial" w:hAnsi="Roboto Mono" w:cs="Arial"/>
+          <w:color w:val="000000"/>
+          <w:szCs w:val="36"/>
+        </w:rPr>
+        <w:t>3}</w:t>
       </w:r>
     </w:p>
     <w:p>
@@ -23617,7 +24477,35 @@
         <w:rPr>
           <w:rFonts w:ascii="Roboto Mono" w:hAnsi="Roboto Mono"/>
         </w:rPr>
-        <w:t xml:space="preserve"> N={1,2,3,4,… } forms the basis of number theory.</w:t>
+        <w:t xml:space="preserve"> N</w:t>
+      </w:r>
+      <w:proofErr w:type="gramStart"/>
+      <w:r>
+        <w:rPr>
+          <w:rFonts w:ascii="Roboto Mono" w:hAnsi="Roboto Mono"/>
+        </w:rPr>
+        <w:t>={</w:t>
+      </w:r>
+      <w:proofErr w:type="gramEnd"/>
+      <w:r>
+        <w:rPr>
+          <w:rFonts w:ascii="Roboto Mono" w:hAnsi="Roboto Mono"/>
+        </w:rPr>
+        <w:t>1,2,</w:t>
+      </w:r>
+      <w:proofErr w:type="gramStart"/>
+      <w:r>
+        <w:rPr>
+          <w:rFonts w:ascii="Roboto Mono" w:hAnsi="Roboto Mono"/>
+        </w:rPr>
+        <w:t>3,4,…</w:t>
+      </w:r>
+      <w:proofErr w:type="gramEnd"/>
+      <w:r>
+        <w:rPr>
+          <w:rFonts w:ascii="Roboto Mono" w:hAnsi="Roboto Mono"/>
+        </w:rPr>
+        <w:t> } forms the basis of number theory.</w:t>
       </w:r>
       <w:r>
         <w:rPr>
@@ -23777,11 +24665,47 @@
         <w:t xml:space="preserve"> can be expressed as R={</w:t>
       </w:r>
       <w:proofErr w:type="spellStart"/>
-      <w:r>
-        <w:rPr>
-          <w:rFonts w:ascii="Roboto Mono" w:hAnsi="Roboto Mono"/>
-        </w:rPr>
-        <w:t>red,orange,yellow,green,blue,indigo,violet</w:t>
+      <w:proofErr w:type="gramStart"/>
+      <w:r>
+        <w:rPr>
+          <w:rFonts w:ascii="Roboto Mono" w:hAnsi="Roboto Mono"/>
+        </w:rPr>
+        <w:t>red,orange</w:t>
+      </w:r>
+      <w:proofErr w:type="gramEnd"/>
+      <w:r>
+        <w:rPr>
+          <w:rFonts w:ascii="Roboto Mono" w:hAnsi="Roboto Mono"/>
+        </w:rPr>
+        <w:t>,</w:t>
+      </w:r>
+      <w:proofErr w:type="gramStart"/>
+      <w:r>
+        <w:rPr>
+          <w:rFonts w:ascii="Roboto Mono" w:hAnsi="Roboto Mono"/>
+        </w:rPr>
+        <w:t>yellow,green</w:t>
+      </w:r>
+      <w:proofErr w:type="gramEnd"/>
+      <w:r>
+        <w:rPr>
+          <w:rFonts w:ascii="Roboto Mono" w:hAnsi="Roboto Mono"/>
+        </w:rPr>
+        <w:t>,</w:t>
+      </w:r>
+      <w:proofErr w:type="gramStart"/>
+      <w:r>
+        <w:rPr>
+          <w:rFonts w:ascii="Roboto Mono" w:hAnsi="Roboto Mono"/>
+        </w:rPr>
+        <w:t>blue,indigo</w:t>
+      </w:r>
+      <w:proofErr w:type="gramEnd"/>
+      <w:r>
+        <w:rPr>
+          <w:rFonts w:ascii="Roboto Mono" w:hAnsi="Roboto Mono"/>
+        </w:rPr>
+        <w:t>,violet</w:t>
       </w:r>
       <w:proofErr w:type="spellEnd"/>
       <w:r>
@@ -24049,7 +24973,35 @@
         <w:rPr>
           <w:rFonts w:ascii="Roboto Mono" w:hAnsi="Roboto Mono"/>
         </w:rPr>
-        <w:t xml:space="preserve"> If A={1,2} and B={1,2,3,4}, then A</w:t>
+        <w:t xml:space="preserve"> If A</w:t>
+      </w:r>
+      <w:proofErr w:type="gramStart"/>
+      <w:r>
+        <w:rPr>
+          <w:rFonts w:ascii="Roboto Mono" w:hAnsi="Roboto Mono"/>
+        </w:rPr>
+        <w:t>={</w:t>
+      </w:r>
+      <w:proofErr w:type="gramEnd"/>
+      <w:r>
+        <w:rPr>
+          <w:rFonts w:ascii="Roboto Mono" w:hAnsi="Roboto Mono"/>
+        </w:rPr>
+        <w:t>1,2} and B</w:t>
+      </w:r>
+      <w:proofErr w:type="gramStart"/>
+      <w:r>
+        <w:rPr>
+          <w:rFonts w:ascii="Roboto Mono" w:hAnsi="Roboto Mono"/>
+        </w:rPr>
+        <w:t>={</w:t>
+      </w:r>
+      <w:proofErr w:type="gramEnd"/>
+      <w:r>
+        <w:rPr>
+          <w:rFonts w:ascii="Roboto Mono" w:hAnsi="Roboto Mono"/>
+        </w:rPr>
+        <w:t>1,2,3,4}, then A</w:t>
       </w:r>
       <w:r>
         <w:rPr>
@@ -24086,7 +25038,35 @@
         <w:rPr>
           <w:rFonts w:ascii="Roboto Mono" w:hAnsi="Roboto Mono"/>
         </w:rPr>
-        <w:t xml:space="preserve"> If X={1,2,3} and Y={2,3,4}, then X</w:t>
+        <w:t xml:space="preserve"> If X</w:t>
+      </w:r>
+      <w:proofErr w:type="gramStart"/>
+      <w:r>
+        <w:rPr>
+          <w:rFonts w:ascii="Roboto Mono" w:hAnsi="Roboto Mono"/>
+        </w:rPr>
+        <w:t>={</w:t>
+      </w:r>
+      <w:proofErr w:type="gramEnd"/>
+      <w:r>
+        <w:rPr>
+          <w:rFonts w:ascii="Roboto Mono" w:hAnsi="Roboto Mono"/>
+        </w:rPr>
+        <w:t>1,2,3} and Y</w:t>
+      </w:r>
+      <w:proofErr w:type="gramStart"/>
+      <w:r>
+        <w:rPr>
+          <w:rFonts w:ascii="Roboto Mono" w:hAnsi="Roboto Mono"/>
+        </w:rPr>
+        <w:t>={</w:t>
+      </w:r>
+      <w:proofErr w:type="gramEnd"/>
+      <w:r>
+        <w:rPr>
+          <w:rFonts w:ascii="Roboto Mono" w:hAnsi="Roboto Mono"/>
+        </w:rPr>
+        <w:t>2,3,4}, then X</w:t>
       </w:r>
       <w:r>
         <w:rPr>
@@ -24098,7 +25078,21 @@
         <w:rPr>
           <w:rFonts w:ascii="Roboto Mono" w:hAnsi="Roboto Mono"/>
         </w:rPr>
-        <w:t>Y={2,3} (common elements).</w:t>
+        <w:t>Y</w:t>
+      </w:r>
+      <w:proofErr w:type="gramStart"/>
+      <w:r>
+        <w:rPr>
+          <w:rFonts w:ascii="Roboto Mono" w:hAnsi="Roboto Mono"/>
+        </w:rPr>
+        <w:t>={</w:t>
+      </w:r>
+      <w:proofErr w:type="gramEnd"/>
+      <w:r>
+        <w:rPr>
+          <w:rFonts w:ascii="Roboto Mono" w:hAnsi="Roboto Mono"/>
+        </w:rPr>
+        <w:t>2,3} (common elements).</w:t>
       </w:r>
     </w:p>
     <w:p>
@@ -24124,7 +25118,35 @@
         <w:rPr>
           <w:rFonts w:ascii="Roboto Mono" w:hAnsi="Roboto Mono"/>
         </w:rPr>
-        <w:t xml:space="preserve"> If X={1,2,3} and Y={2,3,4}, then X</w:t>
+        <w:t xml:space="preserve"> If X</w:t>
+      </w:r>
+      <w:proofErr w:type="gramStart"/>
+      <w:r>
+        <w:rPr>
+          <w:rFonts w:ascii="Roboto Mono" w:hAnsi="Roboto Mono"/>
+        </w:rPr>
+        <w:t>={</w:t>
+      </w:r>
+      <w:proofErr w:type="gramEnd"/>
+      <w:r>
+        <w:rPr>
+          <w:rFonts w:ascii="Roboto Mono" w:hAnsi="Roboto Mono"/>
+        </w:rPr>
+        <w:t>1,2,3} and Y</w:t>
+      </w:r>
+      <w:proofErr w:type="gramStart"/>
+      <w:r>
+        <w:rPr>
+          <w:rFonts w:ascii="Roboto Mono" w:hAnsi="Roboto Mono"/>
+        </w:rPr>
+        <w:t>={</w:t>
+      </w:r>
+      <w:proofErr w:type="gramEnd"/>
+      <w:r>
+        <w:rPr>
+          <w:rFonts w:ascii="Roboto Mono" w:hAnsi="Roboto Mono"/>
+        </w:rPr>
+        <w:t>2,3,4}, then X</w:t>
       </w:r>
       <w:r>
         <w:rPr>
@@ -24136,7 +25158,21 @@
         <w:rPr>
           <w:rFonts w:ascii="Roboto Mono" w:hAnsi="Roboto Mono"/>
         </w:rPr>
-        <w:t>Y={1,2,3,4} (all unique elements).</w:t>
+        <w:t>Y</w:t>
+      </w:r>
+      <w:proofErr w:type="gramStart"/>
+      <w:r>
+        <w:rPr>
+          <w:rFonts w:ascii="Roboto Mono" w:hAnsi="Roboto Mono"/>
+        </w:rPr>
+        <w:t>={</w:t>
+      </w:r>
+      <w:proofErr w:type="gramEnd"/>
+      <w:r>
+        <w:rPr>
+          <w:rFonts w:ascii="Roboto Mono" w:hAnsi="Roboto Mono"/>
+        </w:rPr>
+        <w:t>1,2,3,4} (all unique elements).</w:t>
       </w:r>
     </w:p>
     <w:p>
@@ -24273,9 +25309,17 @@
         <w:rPr>
           <w:rFonts w:ascii="Roboto Mono" w:hAnsi="Roboto Mono"/>
         </w:rPr>
-        <w:t>Example: Let A={</w:t>
+        <w:t>Example: Let A</w:t>
+      </w:r>
+      <w:proofErr w:type="gramStart"/>
+      <w:r>
+        <w:rPr>
+          <w:rFonts w:ascii="Roboto Mono" w:hAnsi="Roboto Mono"/>
+        </w:rPr>
+        <w:t>={</w:t>
       </w:r>
       <w:proofErr w:type="spellStart"/>
+      <w:proofErr w:type="gramEnd"/>
       <w:r>
         <w:rPr>
           <w:rFonts w:ascii="Roboto Mono" w:hAnsi="Roboto Mono"/>
@@ -24299,9 +25343,17 @@
         <w:rPr>
           <w:rFonts w:ascii="Roboto Mono" w:hAnsi="Roboto Mono"/>
         </w:rPr>
-        <w:t xml:space="preserve"> is a multiple of 2} and B={</w:t>
+        <w:t xml:space="preserve"> is a multiple of 2} and B</w:t>
+      </w:r>
+      <w:proofErr w:type="gramStart"/>
+      <w:r>
+        <w:rPr>
+          <w:rFonts w:ascii="Roboto Mono" w:hAnsi="Roboto Mono"/>
+        </w:rPr>
+        <w:t>={</w:t>
       </w:r>
       <w:proofErr w:type="spellStart"/>
+      <w:proofErr w:type="gramEnd"/>
       <w:r>
         <w:rPr>
           <w:rFonts w:ascii="Roboto Mono" w:hAnsi="Roboto Mono"/>
@@ -24602,7 +25654,21 @@
         <w:rPr>
           <w:rFonts w:ascii="Roboto Mono" w:hAnsi="Roboto Mono"/>
         </w:rPr>
-        <w:t>S={students who like soccer}</w:t>
+        <w:t>S</w:t>
+      </w:r>
+      <w:proofErr w:type="gramStart"/>
+      <w:r>
+        <w:rPr>
+          <w:rFonts w:ascii="Roboto Mono" w:hAnsi="Roboto Mono"/>
+        </w:rPr>
+        <w:t>={</w:t>
+      </w:r>
+      <w:proofErr w:type="gramEnd"/>
+      <w:r>
+        <w:rPr>
+          <w:rFonts w:ascii="Roboto Mono" w:hAnsi="Roboto Mono"/>
+        </w:rPr>
+        <w:t>students who like soccer}</w:t>
       </w:r>
     </w:p>
     <w:p>
@@ -24620,7 +25686,21 @@
           <w:rFonts w:ascii="Roboto Mono" w:hAnsi="Roboto Mono"/>
         </w:rPr>
         <w:lastRenderedPageBreak/>
-        <w:t>B={students who like basketball}</w:t>
+        <w:t>B</w:t>
+      </w:r>
+      <w:proofErr w:type="gramStart"/>
+      <w:r>
+        <w:rPr>
+          <w:rFonts w:ascii="Roboto Mono" w:hAnsi="Roboto Mono"/>
+        </w:rPr>
+        <w:t>={</w:t>
+      </w:r>
+      <w:proofErr w:type="gramEnd"/>
+      <w:r>
+        <w:rPr>
+          <w:rFonts w:ascii="Roboto Mono" w:hAnsi="Roboto Mono"/>
+        </w:rPr>
+        <w:t>students who like basketball}</w:t>
       </w:r>
     </w:p>
     <w:p>
@@ -24910,8 +25990,16 @@
         <w:rPr>
           <w:rFonts w:ascii="Roboto Mono" w:hAnsi="Roboto Mono"/>
         </w:rPr>
-        <w:t xml:space="preserve"> f:A</w:t>
-      </w:r>
+        <w:t xml:space="preserve"> </w:t>
+      </w:r>
+      <w:proofErr w:type="gramStart"/>
+      <w:r>
+        <w:rPr>
+          <w:rFonts w:ascii="Roboto Mono" w:hAnsi="Roboto Mono"/>
+        </w:rPr>
+        <w:t>f:A</w:t>
+      </w:r>
+      <w:proofErr w:type="gramEnd"/>
       <w:r>
         <w:rPr>
           <w:rFonts w:ascii="Arial" w:hAnsi="Arial" w:cs="Arial"/>
@@ -24922,7 +26010,21 @@
         <w:rPr>
           <w:rFonts w:ascii="Roboto Mono" w:hAnsi="Roboto Mono"/>
         </w:rPr>
-        <w:t>B can be defined as a set of ordered pairs, like f={(1,a),(2,b),(3,c)}, mapping elements from set A to set B.</w:t>
+        <w:t>B can be defined as a set of ordered pairs, like f={(</w:t>
+      </w:r>
+      <w:proofErr w:type="gramStart"/>
+      <w:r>
+        <w:rPr>
+          <w:rFonts w:ascii="Roboto Mono" w:hAnsi="Roboto Mono"/>
+        </w:rPr>
+        <w:t>1,a),(2,b),(3,c</w:t>
+      </w:r>
+      <w:proofErr w:type="gramEnd"/>
+      <w:r>
+        <w:rPr>
+          <w:rFonts w:ascii="Roboto Mono" w:hAnsi="Roboto Mono"/>
+        </w:rPr>
+        <w:t>)}, mapping elements from set A to set B.</w:t>
       </w:r>
       <w:r>
         <w:rPr>
@@ -25075,7 +26177,35 @@
         <w:rPr>
           <w:rFonts w:ascii="Roboto Mono" w:hAnsi="Roboto Mono"/>
         </w:rPr>
-        <w:t xml:space="preserve"> Z={…,−2,−1,0,1,2,… } is infinite but countable.</w:t>
+        <w:t xml:space="preserve"> Z</w:t>
+      </w:r>
+      <w:proofErr w:type="gramStart"/>
+      <w:r>
+        <w:rPr>
+          <w:rFonts w:ascii="Roboto Mono" w:hAnsi="Roboto Mono"/>
+        </w:rPr>
+        <w:t>={…,−2,−</w:t>
+      </w:r>
+      <w:proofErr w:type="gramEnd"/>
+      <w:r>
+        <w:rPr>
+          <w:rFonts w:ascii="Roboto Mono" w:hAnsi="Roboto Mono"/>
+        </w:rPr>
+        <w:t>1,0,</w:t>
+      </w:r>
+      <w:proofErr w:type="gramStart"/>
+      <w:r>
+        <w:rPr>
+          <w:rFonts w:ascii="Roboto Mono" w:hAnsi="Roboto Mono"/>
+        </w:rPr>
+        <w:t>1,2,…</w:t>
+      </w:r>
+      <w:proofErr w:type="gramEnd"/>
+      <w:r>
+        <w:rPr>
+          <w:rFonts w:ascii="Roboto Mono" w:hAnsi="Roboto Mono"/>
+        </w:rPr>
+        <w:t> } is infinite but countable.</w:t>
       </w:r>
     </w:p>
     <w:p>
@@ -25700,6 +26830,316 @@
           <w:rFonts w:ascii="Roboto Mono" w:hAnsi="Roboto Mono"/>
         </w:rPr>
       </w:pPr>
+    </w:p>
+    <w:p/>
+    <w:p>
+      <w:pPr>
+        <w:pStyle w:val="Heading2"/>
+      </w:pPr>
+      <w:r>
+        <w:lastRenderedPageBreak/>
+        <w:t>Academic Source</w:t>
+      </w:r>
+    </w:p>
+    <w:p>
+      <w:pPr>
+        <w:pStyle w:val="Heading3"/>
+      </w:pPr>
+      <w:r>
+        <w:t>Part 1</w:t>
+      </w:r>
+    </w:p>
+    <w:p>
+      <w:pPr>
+        <w:pStyle w:val="Heading4"/>
+      </w:pPr>
+      <w:r>
+        <w:t>Sets</w:t>
+      </w:r>
+    </w:p>
+    <w:p>
+      <w:r>
+        <w:rPr>
+          <w:rFonts w:ascii="Arial" w:eastAsia="Arial" w:hAnsi="Arial" w:cs="Arial"/>
+          <w:b/>
+          <w:bCs/>
+          <w:sz w:val="18"/>
+          <w:szCs w:val="18"/>
+          <w:highlight w:val="lightGray"/>
+        </w:rPr>
+        <w:t xml:space="preserve"># Source: </w:t>
+      </w:r>
+      <w:r>
+        <w:rPr>
+          <w:rFonts w:ascii="Arial" w:hAnsi="Arial" w:cs="Arial"/>
+          <w:b/>
+          <w:bCs/>
+          <w:sz w:val="18"/>
+          <w:szCs w:val="18"/>
+          <w:highlight w:val="lightGray"/>
+        </w:rPr>
+        <w:t>Academic source</w:t>
+      </w:r>
+      <w:r>
+        <w:rPr>
+          <w:rFonts w:ascii="Arial" w:eastAsia="Arial" w:hAnsi="Arial" w:cs="Arial"/>
+          <w:sz w:val="18"/>
+          <w:szCs w:val="18"/>
+          <w:highlight w:val="lightGray"/>
+        </w:rPr>
+        <w:t xml:space="preserve">: </w:t>
+      </w:r>
+      <w:r>
+        <w:rPr>
+          <w:rFonts w:ascii="Arial" w:eastAsia="Arial" w:hAnsi="Arial" w:cs="Arial"/>
+          <w:b/>
+          <w:bCs/>
+          <w:sz w:val="18"/>
+          <w:szCs w:val="18"/>
+          <w:highlight w:val="lightGray"/>
+        </w:rPr>
+        <w:t>Provided by:</w:t>
+      </w:r>
+      <w:r>
+        <w:rPr>
+          <w:rFonts w:ascii="Arial" w:eastAsia="Arial" w:hAnsi="Arial" w:cs="Arial"/>
+          <w:sz w:val="18"/>
+          <w:szCs w:val="18"/>
+          <w:highlight w:val="lightGray"/>
+        </w:rPr>
+        <w:t xml:space="preserve"> [</w:t>
+      </w:r>
+      <w:r>
+        <w:rPr>
+          <w:rFonts w:ascii="Arial" w:eastAsia="Arial" w:hAnsi="Arial" w:cs="Arial"/>
+          <w:b/>
+          <w:color w:val="000000"/>
+          <w:sz w:val="18"/>
+          <w:highlight w:val="lightGray"/>
+        </w:rPr>
+        <w:t>Data Path</w:t>
+      </w:r>
+      <w:r>
+        <w:rPr>
+          <w:rFonts w:ascii="Arial" w:eastAsia="Arial" w:hAnsi="Arial" w:cs="Arial"/>
+          <w:color w:val="000000"/>
+          <w:sz w:val="18"/>
+          <w:highlight w:val="lightGray"/>
+        </w:rPr>
+        <w:t xml:space="preserve">: Persons Table -&gt; ID Column: 1, </w:t>
+      </w:r>
+      <w:proofErr w:type="spellStart"/>
+      <w:r>
+        <w:rPr>
+          <w:rFonts w:ascii="Arial" w:eastAsia="Arial" w:hAnsi="Arial" w:cs="Arial"/>
+          <w:color w:val="000000"/>
+          <w:sz w:val="18"/>
+          <w:highlight w:val="lightGray"/>
+        </w:rPr>
+        <w:t>Name_En</w:t>
+      </w:r>
+      <w:proofErr w:type="spellEnd"/>
+      <w:r>
+        <w:rPr>
+          <w:rFonts w:ascii="Arial" w:eastAsia="Arial" w:hAnsi="Arial" w:cs="Arial"/>
+          <w:color w:val="000000"/>
+          <w:sz w:val="18"/>
+          <w:highlight w:val="lightGray"/>
+        </w:rPr>
+        <w:t xml:space="preserve"> Column: Motasem Essam</w:t>
+      </w:r>
+      <w:r>
+        <w:rPr>
+          <w:rFonts w:ascii="Arial" w:eastAsia="Arial" w:hAnsi="Arial" w:cs="Arial"/>
+          <w:sz w:val="18"/>
+          <w:szCs w:val="18"/>
+          <w:highlight w:val="lightGray"/>
+        </w:rPr>
+        <w:t xml:space="preserve">] -&gt; </w:t>
+      </w:r>
+      <w:r>
+        <w:rPr>
+          <w:rFonts w:ascii="Arial" w:eastAsia="Arial" w:hAnsi="Arial" w:cs="Arial"/>
+          <w:b/>
+          <w:bCs/>
+          <w:sz w:val="18"/>
+          <w:szCs w:val="18"/>
+          <w:highlight w:val="lightGray"/>
+        </w:rPr>
+        <w:t>From:</w:t>
+      </w:r>
+      <w:r>
+        <w:rPr>
+          <w:rFonts w:ascii="Arial" w:eastAsia="Arial" w:hAnsi="Arial" w:cs="Arial"/>
+          <w:sz w:val="18"/>
+          <w:szCs w:val="18"/>
+          <w:highlight w:val="lightGray"/>
+        </w:rPr>
+        <w:t xml:space="preserve"> [</w:t>
+      </w:r>
+      <w:r>
+        <w:rPr>
+          <w:rFonts w:ascii="Arial" w:eastAsia="Arial" w:hAnsi="Arial" w:cs="Arial"/>
+          <w:b/>
+          <w:bCs/>
+          <w:sz w:val="18"/>
+          <w:szCs w:val="18"/>
+          <w:highlight w:val="lightGray"/>
+        </w:rPr>
+        <w:t>Data Path</w:t>
+      </w:r>
+      <w:r>
+        <w:rPr>
+          <w:rFonts w:ascii="Arial" w:eastAsia="Arial" w:hAnsi="Arial" w:cs="Arial"/>
+          <w:sz w:val="18"/>
+          <w:szCs w:val="18"/>
+          <w:highlight w:val="lightGray"/>
+        </w:rPr>
+        <w:t xml:space="preserve">: Sources Table -&gt; ID Column: </w:t>
+      </w:r>
+      <w:r>
+        <w:rPr>
+          <w:rFonts w:ascii="Arial" w:eastAsia="Arial" w:hAnsi="Arial" w:cs="Arial"/>
+          <w:sz w:val="18"/>
+          <w:szCs w:val="18"/>
+          <w:highlight w:val="lightGray"/>
+        </w:rPr>
+        <w:t>316</w:t>
+      </w:r>
+      <w:r>
+        <w:rPr>
+          <w:rFonts w:ascii="Arial" w:eastAsia="Arial" w:hAnsi="Arial" w:cs="Arial"/>
+          <w:sz w:val="18"/>
+          <w:szCs w:val="18"/>
+          <w:highlight w:val="lightGray"/>
+        </w:rPr>
+        <w:t xml:space="preserve">, Content Title Column: </w:t>
+      </w:r>
+      <w:r>
+        <w:rPr>
+          <w:rFonts w:ascii="Arial" w:eastAsia="Arial" w:hAnsi="Arial" w:cs="Arial"/>
+          <w:sz w:val="18"/>
+          <w:szCs w:val="18"/>
+          <w:highlight w:val="lightGray"/>
+        </w:rPr>
+        <w:t>Math - First Primary - First Semester</w:t>
+      </w:r>
+      <w:r>
+        <w:rPr>
+          <w:rFonts w:ascii="Arial" w:eastAsia="Arial" w:hAnsi="Arial" w:cs="Arial"/>
+          <w:sz w:val="18"/>
+          <w:szCs w:val="18"/>
+          <w:highlight w:val="lightGray"/>
+        </w:rPr>
+        <w:t xml:space="preserve">] -&gt; </w:t>
+      </w:r>
+      <w:r>
+        <w:rPr>
+          <w:rFonts w:ascii="Arial" w:eastAsia="Arial" w:hAnsi="Arial" w:cs="Arial"/>
+          <w:b/>
+          <w:bCs/>
+          <w:sz w:val="18"/>
+          <w:szCs w:val="18"/>
+          <w:highlight w:val="lightGray"/>
+        </w:rPr>
+        <w:t>at</w:t>
+      </w:r>
+      <w:r>
+        <w:rPr>
+          <w:rFonts w:ascii="Arial" w:eastAsia="Arial" w:hAnsi="Arial" w:cs="Arial"/>
+          <w:sz w:val="18"/>
+          <w:szCs w:val="18"/>
+          <w:highlight w:val="lightGray"/>
+        </w:rPr>
+        <w:t xml:space="preserve">: [Document, page: 1, Top, </w:t>
+      </w:r>
+      <w:r>
+        <w:rPr>
+          <w:rFonts w:ascii="Arial" w:eastAsia="Arial" w:hAnsi="Arial" w:cs="Arial"/>
+          <w:highlight w:val="lightGray"/>
+          <w:lang w:bidi="ar-EG"/>
+        </w:rPr>
+        <w:t>“</w:t>
+      </w:r>
+      <w:r>
+        <w:rPr>
+          <w:rFonts w:ascii="Arial" w:eastAsia="Arial" w:hAnsi="Arial" w:cs="Arial"/>
+          <w:sz w:val="18"/>
+          <w:szCs w:val="18"/>
+          <w:highlight w:val="lightGray"/>
+        </w:rPr>
+        <w:t>Chemistry</w:t>
+      </w:r>
+      <w:r>
+        <w:rPr>
+          <w:rFonts w:ascii="Arial" w:eastAsia="Arial" w:hAnsi="Arial" w:cs="Arial"/>
+          <w:sz w:val="18"/>
+          <w:szCs w:val="18"/>
+          <w:highlight w:val="lightGray"/>
+        </w:rPr>
+        <w:t xml:space="preserve"> </w:t>
+      </w:r>
+      <w:r>
+        <w:rPr>
+          <w:rFonts w:ascii="Arial" w:eastAsia="Arial" w:hAnsi="Arial" w:cs="Arial"/>
+          <w:sz w:val="18"/>
+          <w:szCs w:val="18"/>
+          <w:highlight w:val="lightGray"/>
+        </w:rPr>
+        <w:t>is the branch of science...</w:t>
+      </w:r>
+      <w:r>
+        <w:rPr>
+          <w:highlight w:val="lightGray"/>
+        </w:rPr>
+        <w:t xml:space="preserve"> </w:t>
+      </w:r>
+      <w:r>
+        <w:rPr>
+          <w:rFonts w:ascii="Arial" w:eastAsia="Arial" w:hAnsi="Arial" w:cs="Arial"/>
+          <w:sz w:val="18"/>
+          <w:szCs w:val="18"/>
+          <w:highlight w:val="lightGray"/>
+        </w:rPr>
+        <w:t>and how it changes.</w:t>
+      </w:r>
+      <w:r>
+        <w:rPr>
+          <w:rFonts w:ascii="Arial" w:eastAsia="Arial" w:hAnsi="Arial" w:cs="Arial"/>
+          <w:highlight w:val="lightGray"/>
+          <w:lang w:bidi="ar-EG"/>
+        </w:rPr>
+        <w:t>”]</w:t>
+      </w:r>
+      <w:r>
+        <w:rPr>
+          <w:rFonts w:ascii="Arial" w:eastAsia="Arial" w:hAnsi="Arial" w:cs="Arial"/>
+          <w:sz w:val="18"/>
+          <w:szCs w:val="18"/>
+          <w:highlight w:val="lightGray"/>
+        </w:rPr>
+        <w:t xml:space="preserve"> </w:t>
+      </w:r>
+      <w:r>
+        <w:rPr>
+          <w:rFonts w:ascii="Arial" w:eastAsia="Arial" w:hAnsi="Arial" w:cs="Arial"/>
+          <w:b/>
+          <w:bCs/>
+          <w:sz w:val="18"/>
+          <w:szCs w:val="18"/>
+          <w:highlight w:val="lightGray"/>
+        </w:rPr>
+        <w:t>on</w:t>
+      </w:r>
+      <w:r>
+        <w:rPr>
+          <w:rFonts w:ascii="Arial" w:eastAsia="Arial" w:hAnsi="Arial" w:cs="Arial"/>
+          <w:sz w:val="18"/>
+          <w:szCs w:val="18"/>
+          <w:highlight w:val="lightGray"/>
+        </w:rPr>
+        <w:t xml:space="preserve"> [7/14/2025]</w:t>
+      </w:r>
     </w:p>
     <w:p/>
     <w:sectPr>
@@ -36744,6 +38184,7 @@
   <w:style w:type="character" w:default="1" w:styleId="DefaultParagraphFont">
     <w:name w:val="Default Paragraph Font"/>
     <w:uiPriority w:val="1"/>
+    <w:semiHidden/>
     <w:unhideWhenUsed/>
   </w:style>
   <w:style w:type="table" w:default="1" w:styleId="TableNormal">

</xml_diff>